<commit_message>
Revisi: restrukturisasi Kajian Teori (sub-bab + sintesis tiap teori) & ringkas Rumusan Masalah menjadi 2 (selaraskan Tujuan & Pertanyaan Penelitian)
</commit_message>
<xml_diff>
--- a/Proposal Tesis - Strategi Manajemen Reputasi SD Muhammadiyah Condongcatur.docx
+++ b/Proposal Tesis - Strategi Manajemen Reputasi SD Muhammadiyah Condongcatur.docx
@@ -859,7 +859,7 @@
           <w:b w:val="0"/>
           <w:sz w:val="24"/>
         </w:rPr>
-        <w:t>Berdasarkan pembatasan masalah, rumusan masalah dalam penelitian ini adalah: “Bagaimana strategi manajemen reputasi dalam memperkuat keunggulan kompetitif di SD Muhammadiyah Condongcatur?” Rumusan masalah tersebut dijabarkan ke dalam pertanyaan-pertanyaan berikut.</w:t>
+        <w:t>Berdasarkan latar belakang dan pembatasan masalah di atas, rumusan masalah dalam penelitian ini dirumuskan sebagai berikut.</w:t>
       </w:r>
     </w:p>
     <w:p>
@@ -874,7 +874,7 @@
           <w:b w:val="0"/>
           <w:sz w:val="24"/>
         </w:rPr>
-        <w:t>1. Bagaimana perencanaan strategi manajemen reputasi di SD Muhammadiyah Condongcatur?</w:t>
+        <w:t>1. Bagaimana strategi manajemen reputasi dalam memperkuat keunggulan kompetitif di SD Muhammadiyah Condongcatur?</w:t>
       </w:r>
     </w:p>
     <w:p>
@@ -889,7 +889,36 @@
           <w:b w:val="0"/>
           <w:sz w:val="24"/>
         </w:rPr>
-        <w:t>2. Bagaimana pelaksanaan strategi manajemen reputasi dalam memperkuat keunggulan kompetitif di SD Muhammadiyah Condongcatur?</w:t>
+        <w:t>2. Apa faktor pendukung dan penghambat strategi manajemen reputasi dalam memperkuat keunggulan kompetitif di SD Muhammadiyah Condongcatur?</w:t>
+      </w:r>
+    </w:p>
+    <w:p>
+      <w:pPr>
+        <w:spacing w:line="360" w:lineRule="auto" w:before="120" w:after="80"/>
+        <w:jc w:val="left"/>
+      </w:pPr>
+      <w:r>
+        <w:rPr>
+          <w:rFonts w:ascii="Times New Roman" w:hAnsi="Times New Roman" w:eastAsia="Times New Roman"/>
+          <w:b/>
+          <w:sz w:val="24"/>
+        </w:rPr>
+        <w:t>E. Tujuan Penelitian</w:t>
+      </w:r>
+    </w:p>
+    <w:p>
+      <w:pPr>
+        <w:spacing w:line="360" w:lineRule="auto" w:after="80" w:before="0"/>
+        <w:ind w:firstLine="720"/>
+        <w:jc w:val="both"/>
+      </w:pPr>
+      <w:r>
+        <w:rPr>
+          <w:rFonts w:ascii="Times New Roman" w:hAnsi="Times New Roman" w:eastAsia="Times New Roman"/>
+          <w:b w:val="0"/>
+          <w:sz w:val="24"/>
+        </w:rPr>
+        <w:t>Sejalan dengan rumusan masalah, penelitian ini bertujuan untuk:</w:t>
       </w:r>
     </w:p>
     <w:p>
@@ -904,7 +933,7 @@
           <w:b w:val="0"/>
           <w:sz w:val="24"/>
         </w:rPr>
-        <w:t>3. Bagaimana evaluasi strategi manajemen reputasi di SD Muhammadiyah Condongcatur?</w:t>
+        <w:t>1. Mendeskripsikan dan menganalisis strategi manajemen reputasi dalam memperkuat keunggulan kompetitif di SD Muhammadiyah Condongcatur.</w:t>
       </w:r>
     </w:p>
     <w:p>
@@ -919,7 +948,7 @@
           <w:b w:val="0"/>
           <w:sz w:val="24"/>
         </w:rPr>
-        <w:t>4. Apa saja faktor pendukung dan penghambat dalam implementasi strategi manajemen reputasi untuk memperkuat keunggulan kompetitif di SD Muhammadiyah Condongcatur?</w:t>
+        <w:t>2. Mendeskripsikan dan menganalisis faktor pendukung dan penghambat strategi manajemen reputasi dalam memperkuat keunggulan kompetitif di SD Muhammadiyah Condongcatur.</w:t>
       </w:r>
     </w:p>
     <w:p>
@@ -933,12 +962,27 @@
           <w:b/>
           <w:sz w:val="24"/>
         </w:rPr>
-        <w:t>E. Tujuan Penelitian</w:t>
+        <w:t>F. Manfaat Penelitian</w:t>
       </w:r>
     </w:p>
     <w:p>
       <w:pPr>
-        <w:spacing w:line="360" w:lineRule="auto" w:after="80" w:before="0"/>
+        <w:spacing w:line="360" w:lineRule="auto" w:before="80" w:after="40"/>
+        <w:ind w:left="425"/>
+        <w:jc w:val="left"/>
+      </w:pPr>
+      <w:r>
+        <w:rPr>
+          <w:rFonts w:ascii="Times New Roman" w:hAnsi="Times New Roman" w:eastAsia="Times New Roman"/>
+          <w:b/>
+          <w:sz w:val="24"/>
+        </w:rPr>
+        <w:t>1. Manfaat Teoretis</w:t>
+      </w:r>
+    </w:p>
+    <w:p>
+      <w:pPr>
+        <w:spacing w:line="360" w:lineRule="auto" w:after="120" w:before="0"/>
         <w:ind w:firstLine="720"/>
         <w:jc w:val="both"/>
       </w:pPr>
@@ -948,7 +992,39 @@
           <w:b w:val="0"/>
           <w:sz w:val="24"/>
         </w:rPr>
-        <w:t>Sejalan dengan rumusan masalah, penelitian ini bertujuan untuk:</w:t>
+        <w:t>Penelitian ini diharapkan dapat memperkaya khazanah keilmuan manajemen pendidikan, khususnya pada kajian manajemen reputasi dan keunggulan kompetitif lembaga pendidikan dasar. Temuan penelitian dapat memperkuat dan memperluas penerapan teori reputasi (Fombrun, 1996; Ravasi et al., 2018) serta teori berbasis sumber daya (</w:t>
+      </w:r>
+      <w:r>
+        <w:rPr>
+          <w:rFonts w:ascii="Times New Roman" w:hAnsi="Times New Roman" w:eastAsia="Times New Roman"/>
+          <w:b w:val="0"/>
+          <w:i/>
+          <w:sz w:val="24"/>
+        </w:rPr>
+        <w:t>resource-based view</w:t>
+      </w:r>
+      <w:r>
+        <w:rPr>
+          <w:rFonts w:ascii="Times New Roman" w:hAnsi="Times New Roman" w:eastAsia="Times New Roman"/>
+          <w:b w:val="0"/>
+          <w:sz w:val="24"/>
+        </w:rPr>
+        <w:t>) (Barney, 1991) dalam konteks persekolahan, sekaligus menjadi rujukan bagi penelitian sejenis pada masa mendatang.</w:t>
+      </w:r>
+    </w:p>
+    <w:p>
+      <w:pPr>
+        <w:spacing w:line="360" w:lineRule="auto" w:before="80" w:after="40"/>
+        <w:ind w:left="425"/>
+        <w:jc w:val="left"/>
+      </w:pPr>
+      <w:r>
+        <w:rPr>
+          <w:rFonts w:ascii="Times New Roman" w:hAnsi="Times New Roman" w:eastAsia="Times New Roman"/>
+          <w:b/>
+          <w:sz w:val="24"/>
+        </w:rPr>
+        <w:t>2. Manfaat Praktis</w:t>
       </w:r>
     </w:p>
     <w:p>
@@ -963,7 +1039,7 @@
           <w:b w:val="0"/>
           <w:sz w:val="24"/>
         </w:rPr>
-        <w:t>1. Mendeskripsikan dan menganalisis perencanaan strategi manajemen reputasi di SD Muhammadiyah Condongcatur.</w:t>
+        <w:t>a. Bagi sekolah, hasil penelitian dapat menjadi bahan refleksi dan rujukan dalam merumuskan strategi manajemen reputasi yang efektif untuk memperkuat keunggulan kompetitif.</w:t>
       </w:r>
     </w:p>
     <w:p>
@@ -978,7 +1054,7 @@
           <w:b w:val="0"/>
           <w:sz w:val="24"/>
         </w:rPr>
-        <w:t>2. Mendeskripsikan dan menganalisis pelaksanaan strategi manajemen reputasi dalam memperkuat keunggulan kompetitif di SD Muhammadiyah Condongcatur.</w:t>
+        <w:t>b. Bagi kepala sekolah dan tim humas, penelitian ini memberikan gambaran praktik pengelolaan reputasi yang dapat diadaptasi sesuai konteks masing-masing lembaga.</w:t>
       </w:r>
     </w:p>
     <w:p>
@@ -993,7 +1069,24 @@
           <w:b w:val="0"/>
           <w:sz w:val="24"/>
         </w:rPr>
-        <w:t>3. Mendeskripsikan dan menganalisis evaluasi strategi manajemen reputasi di SD Muhammadiyah Condongcatur.</w:t>
+        <w:t>c. Bagi pemangku kepentingan pendidikan (Persyarikatan Muhammadiyah, dinas pendidikan, dan masyarakat), penelitian ini memberikan informasi mengenai praktik baik (</w:t>
+      </w:r>
+      <w:r>
+        <w:rPr>
+          <w:rFonts w:ascii="Times New Roman" w:hAnsi="Times New Roman" w:eastAsia="Times New Roman"/>
+          <w:b w:val="0"/>
+          <w:i/>
+          <w:sz w:val="24"/>
+        </w:rPr>
+        <w:t>best practice</w:t>
+      </w:r>
+      <w:r>
+        <w:rPr>
+          <w:rFonts w:ascii="Times New Roman" w:hAnsi="Times New Roman" w:eastAsia="Times New Roman"/>
+          <w:b w:val="0"/>
+          <w:sz w:val="24"/>
+        </w:rPr>
+        <w:t>) pengelolaan reputasi sekolah dasar.</w:t>
       </w:r>
     </w:p>
     <w:p>
@@ -1008,10 +1101,43 @@
           <w:b w:val="0"/>
           <w:sz w:val="24"/>
         </w:rPr>
-        <w:t>4. Mengidentifikasi faktor pendukung dan penghambat dalam implementasi strategi manajemen reputasi untuk memperkuat keunggulan kompetitif di SD Muhammadiyah Condongcatur.</w:t>
+        <w:t>d. Bagi peneliti lain, hasil penelitian dapat menjadi acuan untuk pengembangan penelitian lanjutan dengan fokus, pendekatan, atau latar yang berbeda.</w:t>
       </w:r>
     </w:p>
     <w:p>
+      <w:r>
+        <w:br w:type="page"/>
+      </w:r>
+    </w:p>
+    <w:p>
+      <w:pPr>
+        <w:spacing w:line="360" w:lineRule="auto" w:after="0"/>
+        <w:jc w:val="center"/>
+      </w:pPr>
+      <w:r>
+        <w:rPr>
+          <w:rFonts w:ascii="Times New Roman" w:hAnsi="Times New Roman" w:eastAsia="Times New Roman"/>
+          <w:b/>
+          <w:sz w:val="24"/>
+        </w:rPr>
+        <w:t>BAB II</w:t>
+      </w:r>
+    </w:p>
+    <w:p>
+      <w:pPr>
+        <w:spacing w:line="360" w:lineRule="auto" w:after="240"/>
+        <w:jc w:val="center"/>
+      </w:pPr>
+      <w:r>
+        <w:rPr>
+          <w:rFonts w:ascii="Times New Roman" w:hAnsi="Times New Roman" w:eastAsia="Times New Roman"/>
+          <w:b/>
+          <w:sz w:val="24"/>
+        </w:rPr>
+        <w:t>KAJIAN PUSTAKA</w:t>
+      </w:r>
+    </w:p>
+    <w:p>
       <w:pPr>
         <w:spacing w:line="360" w:lineRule="auto" w:before="120" w:after="80"/>
         <w:jc w:val="left"/>
@@ -1022,7 +1148,22 @@
           <w:b/>
           <w:sz w:val="24"/>
         </w:rPr>
-        <w:t>F. Manfaat Penelitian</w:t>
+        <w:t>A. Kajian Teori</w:t>
+      </w:r>
+    </w:p>
+    <w:p>
+      <w:pPr>
+        <w:spacing w:line="360" w:lineRule="auto" w:after="120" w:before="0"/>
+        <w:ind w:firstLine="720"/>
+        <w:jc w:val="both"/>
+      </w:pPr>
+      <w:r>
+        <w:rPr>
+          <w:rFonts w:ascii="Times New Roman" w:hAnsi="Times New Roman" w:eastAsia="Times New Roman"/>
+          <w:b w:val="0"/>
+          <w:sz w:val="24"/>
+        </w:rPr>
+        <w:t>Kajian teori pada bagian ini disusun secara deduktif mengikuti alur konsep penelitian, yaitu dimulai dari konsep manajemen reputasi, dilanjutkan dengan konsep keunggulan kompetitif, dan diakhiri dengan integrasi keduanya dalam konteks lembaga pendidikan dasar. Pada setiap akhir pembahasan konsep disajikan sintesis sebagai rumusan pemahaman yang menjadi landasan operasional penelitian.</w:t>
       </w:r>
     </w:p>
     <w:p>
@@ -1037,7 +1178,22 @@
           <w:b/>
           <w:sz w:val="24"/>
         </w:rPr>
-        <w:t>1. Manfaat Teoretis</w:t>
+        <w:t>1. Manajemen Reputasi</w:t>
+      </w:r>
+    </w:p>
+    <w:p>
+      <w:pPr>
+        <w:spacing w:line="360" w:lineRule="auto" w:before="40" w:after="40"/>
+        <w:ind w:left="850"/>
+        <w:jc w:val="left"/>
+      </w:pPr>
+      <w:r>
+        <w:rPr>
+          <w:rFonts w:ascii="Times New Roman" w:hAnsi="Times New Roman" w:eastAsia="Times New Roman"/>
+          <w:b/>
+          <w:sz w:val="24"/>
+        </w:rPr>
+        <w:t>a. Pengertian Reputasi</w:t>
       </w:r>
     </w:p>
     <w:p>
@@ -1052,7 +1208,7 @@
           <w:b w:val="0"/>
           <w:sz w:val="24"/>
         </w:rPr>
-        <w:t>Penelitian ini diharapkan dapat memperkaya khazanah keilmuan manajemen pendidikan, khususnya pada kajian manajemen reputasi dan keunggulan kompetitif lembaga pendidikan dasar. Temuan penelitian dapat memperkuat dan memperluas penerapan teori reputasi (Fombrun, 1996; Ravasi et al., 2018) serta teori berbasis sumber daya (</w:t>
+        <w:t>Reputasi (</w:t>
       </w:r>
       <w:r>
         <w:rPr>
@@ -1061,15 +1217,493 @@
           <w:i/>
           <w:sz w:val="24"/>
         </w:rPr>
-        <w:t>resource-based view</w:t>
-      </w:r>
-      <w:r>
-        <w:rPr>
-          <w:rFonts w:ascii="Times New Roman" w:hAnsi="Times New Roman" w:eastAsia="Times New Roman"/>
-          <w:b w:val="0"/>
-          <w:sz w:val="24"/>
-        </w:rPr>
-        <w:t>) (Barney, 1991) dalam konteks persekolahan, sekaligus menjadi rujukan bagi penelitian sejenis pada masa mendatang.</w:t>
+        <w:t>reputation</w:t>
+      </w:r>
+      <w:r>
+        <w:rPr>
+          <w:rFonts w:ascii="Times New Roman" w:hAnsi="Times New Roman" w:eastAsia="Times New Roman"/>
+          <w:b w:val="0"/>
+          <w:sz w:val="24"/>
+        </w:rPr>
+        <w:t>) merupakan konstruk multidimensi yang mencerminkan penilaian kolektif pemangku kepentingan terhadap suatu organisasi berdasarkan pengalaman, komunikasi, dan perbandingan dengan organisasi lain. Fombrun (1996) mendefinisikan reputasi sebagai representasi persepsi atas tindakan masa lalu dan prospek masa depan organisasi yang menggambarkan daya tariknya bagi seluruh khalayak utama. Ravasi et al. (2018) menegaskan bahwa reputasi terbentuk melalui proses sosial-kognitif yang melibatkan interaksi antara identitas organisasi, tindakan organisasi, dan interpretasi pemangku kepentingan. Reputasi perlu dibedakan dari citra (</w:t>
+      </w:r>
+      <w:r>
+        <w:rPr>
+          <w:rFonts w:ascii="Times New Roman" w:hAnsi="Times New Roman" w:eastAsia="Times New Roman"/>
+          <w:b w:val="0"/>
+          <w:i/>
+          <w:sz w:val="24"/>
+        </w:rPr>
+        <w:t>image</w:t>
+      </w:r>
+      <w:r>
+        <w:rPr>
+          <w:rFonts w:ascii="Times New Roman" w:hAnsi="Times New Roman" w:eastAsia="Times New Roman"/>
+          <w:b w:val="0"/>
+          <w:sz w:val="24"/>
+        </w:rPr>
+        <w:t>) dan identitas (</w:t>
+      </w:r>
+      <w:r>
+        <w:rPr>
+          <w:rFonts w:ascii="Times New Roman" w:hAnsi="Times New Roman" w:eastAsia="Times New Roman"/>
+          <w:b w:val="0"/>
+          <w:i/>
+          <w:sz w:val="24"/>
+        </w:rPr>
+        <w:t>identity</w:t>
+      </w:r>
+      <w:r>
+        <w:rPr>
+          <w:rFonts w:ascii="Times New Roman" w:hAnsi="Times New Roman" w:eastAsia="Times New Roman"/>
+          <w:b w:val="0"/>
+          <w:sz w:val="24"/>
+        </w:rPr>
+        <w:t>): identitas merujuk pada karakter internal organisasi, citra merupakan kesan jangka pendek yang dipersepsikan publik, sedangkan reputasi adalah penilaian yang relatif stabil dan terakumulasi dalam jangka panjang (Van Riel &amp; Fombrun, 2007).</w:t>
+      </w:r>
+    </w:p>
+    <w:p>
+      <w:pPr>
+        <w:spacing w:line="360" w:lineRule="auto" w:after="120" w:before="40"/>
+        <w:ind w:firstLine="720"/>
+        <w:jc w:val="both"/>
+      </w:pPr>
+      <w:r>
+        <w:rPr>
+          <w:rFonts w:ascii="Times New Roman" w:hAnsi="Times New Roman" w:eastAsia="Times New Roman"/>
+          <w:b/>
+          <w:i/>
+          <w:sz w:val="24"/>
+        </w:rPr>
+        <w:t xml:space="preserve">Sintesis. </w:t>
+      </w:r>
+      <w:r>
+        <w:rPr>
+          <w:rFonts w:ascii="Times New Roman" w:hAnsi="Times New Roman" w:eastAsia="Times New Roman"/>
+          <w:b w:val="0"/>
+          <w:sz w:val="24"/>
+        </w:rPr>
+        <w:t>Berdasarkan beberapa pendapat tersebut, dalam penelitian ini reputasi dimaknai sebagai penilaian kolektif pemangku kepentingan yang terbentuk secara akumulatif dari pengalaman dan komunikasi terhadap kinerja serta perilaku organisasi. Dalam konteks sekolah, reputasi merupakan penilaian wali murid dan masyarakat atas mutu, perilaku, dan prestasi sekolah yang bersifat relatif stabil dan menjadi pembeda dari sekolah lain.</w:t>
+      </w:r>
+    </w:p>
+    <w:p>
+      <w:pPr>
+        <w:spacing w:line="360" w:lineRule="auto" w:before="40" w:after="40"/>
+        <w:ind w:left="850"/>
+        <w:jc w:val="left"/>
+      </w:pPr>
+      <w:r>
+        <w:rPr>
+          <w:rFonts w:ascii="Times New Roman" w:hAnsi="Times New Roman" w:eastAsia="Times New Roman"/>
+          <w:b/>
+          <w:sz w:val="24"/>
+        </w:rPr>
+        <w:t>b. Dimensi dan Komponen Reputasi</w:t>
+      </w:r>
+    </w:p>
+    <w:p>
+      <w:pPr>
+        <w:spacing w:line="360" w:lineRule="auto" w:after="120" w:before="0"/>
+        <w:ind w:firstLine="720"/>
+        <w:jc w:val="both"/>
+      </w:pPr>
+      <w:r>
+        <w:rPr>
+          <w:rFonts w:ascii="Times New Roman" w:hAnsi="Times New Roman" w:eastAsia="Times New Roman"/>
+          <w:b w:val="0"/>
+          <w:sz w:val="24"/>
+        </w:rPr>
+        <w:t>Reputasi tersusun atas sejumlah dimensi yang dapat diukur. Overman et al. (2020) mengembangkan barometer reputasi multidimensi yang membedakan subdimensi kinerja, moral, prosedural, dan teknis. Pada perspektif konsumen, Tay et al. (2020) mengidentifikasi determinan reputasi berupa kualitas layanan, tanggung jawab sosial, dan komunikasi, sedangkan Agarwal dan Osiyevskyy (2021) merumuskan tiga faset reputasi organisasi, yakni efektivitas produk dan layanan (</w:t>
+      </w:r>
+      <w:r>
+        <w:rPr>
+          <w:rFonts w:ascii="Times New Roman" w:hAnsi="Times New Roman" w:eastAsia="Times New Roman"/>
+          <w:b w:val="0"/>
+          <w:i/>
+          <w:sz w:val="24"/>
+        </w:rPr>
+        <w:t>product and service efficacy</w:t>
+      </w:r>
+      <w:r>
+        <w:rPr>
+          <w:rFonts w:ascii="Times New Roman" w:hAnsi="Times New Roman" w:eastAsia="Times New Roman"/>
+          <w:b w:val="0"/>
+          <w:sz w:val="24"/>
+        </w:rPr>
+        <w:t>), keunggulan pasar (</w:t>
+      </w:r>
+      <w:r>
+        <w:rPr>
+          <w:rFonts w:ascii="Times New Roman" w:hAnsi="Times New Roman" w:eastAsia="Times New Roman"/>
+          <w:b w:val="0"/>
+          <w:i/>
+          <w:sz w:val="24"/>
+        </w:rPr>
+        <w:t>market prominence</w:t>
+      </w:r>
+      <w:r>
+        <w:rPr>
+          <w:rFonts w:ascii="Times New Roman" w:hAnsi="Times New Roman" w:eastAsia="Times New Roman"/>
+          <w:b w:val="0"/>
+          <w:sz w:val="24"/>
+        </w:rPr>
+        <w:t>), dan etika sosial (</w:t>
+      </w:r>
+      <w:r>
+        <w:rPr>
+          <w:rFonts w:ascii="Times New Roman" w:hAnsi="Times New Roman" w:eastAsia="Times New Roman"/>
+          <w:b w:val="0"/>
+          <w:i/>
+          <w:sz w:val="24"/>
+        </w:rPr>
+        <w:t>societal ethicality</w:t>
+      </w:r>
+      <w:r>
+        <w:rPr>
+          <w:rFonts w:ascii="Times New Roman" w:hAnsi="Times New Roman" w:eastAsia="Times New Roman"/>
+          <w:b w:val="0"/>
+          <w:sz w:val="24"/>
+        </w:rPr>
+        <w:t xml:space="preserve">). Van der Waldt (2022) merinci variabel reputasi yang mencakup identitas, citra, </w:t>
+      </w:r>
+      <w:r>
+        <w:rPr>
+          <w:rFonts w:ascii="Times New Roman" w:hAnsi="Times New Roman" w:eastAsia="Times New Roman"/>
+          <w:b w:val="0"/>
+          <w:i/>
+          <w:sz w:val="24"/>
+        </w:rPr>
+        <w:t>branding</w:t>
+      </w:r>
+      <w:r>
+        <w:rPr>
+          <w:rFonts w:ascii="Times New Roman" w:hAnsi="Times New Roman" w:eastAsia="Times New Roman"/>
+          <w:b w:val="0"/>
+          <w:sz w:val="24"/>
+        </w:rPr>
+        <w:t>, kepribadian, perilaku, budaya, etika, dan penuturan kisah (</w:t>
+      </w:r>
+      <w:r>
+        <w:rPr>
+          <w:rFonts w:ascii="Times New Roman" w:hAnsi="Times New Roman" w:eastAsia="Times New Roman"/>
+          <w:b w:val="0"/>
+          <w:i/>
+          <w:sz w:val="24"/>
+        </w:rPr>
+        <w:t>storytelling</w:t>
+      </w:r>
+      <w:r>
+        <w:rPr>
+          <w:rFonts w:ascii="Times New Roman" w:hAnsi="Times New Roman" w:eastAsia="Times New Roman"/>
+          <w:b w:val="0"/>
+          <w:sz w:val="24"/>
+        </w:rPr>
+        <w:t>).</w:t>
+      </w:r>
+    </w:p>
+    <w:p>
+      <w:pPr>
+        <w:spacing w:line="360" w:lineRule="auto" w:after="120" w:before="40"/>
+        <w:ind w:firstLine="720"/>
+        <w:jc w:val="both"/>
+      </w:pPr>
+      <w:r>
+        <w:rPr>
+          <w:rFonts w:ascii="Times New Roman" w:hAnsi="Times New Roman" w:eastAsia="Times New Roman"/>
+          <w:b/>
+          <w:i/>
+          <w:sz w:val="24"/>
+        </w:rPr>
+        <w:t xml:space="preserve">Sintesis. </w:t>
+      </w:r>
+      <w:r>
+        <w:rPr>
+          <w:rFonts w:ascii="Times New Roman" w:hAnsi="Times New Roman" w:eastAsia="Times New Roman"/>
+          <w:b w:val="0"/>
+          <w:sz w:val="24"/>
+        </w:rPr>
+        <w:t>Dari paparan tersebut dapat disintesiskan bahwa reputasi sekolah bersifat multidimensi dan setidaknya mencakup dimensi mutu layanan dan prestasi (kinerja), nilai dan keteladanan (moral-etika), tata kelola (prosedural), serta komunikasi dan citra. Dimensi-dimensi inilah yang menjadi sasaran pengelolaan dalam strategi manajemen reputasi sekolah.</w:t>
+      </w:r>
+    </w:p>
+    <w:p>
+      <w:pPr>
+        <w:spacing w:line="360" w:lineRule="auto" w:before="40" w:after="40"/>
+        <w:ind w:left="850"/>
+        <w:jc w:val="left"/>
+      </w:pPr>
+      <w:r>
+        <w:rPr>
+          <w:rFonts w:ascii="Times New Roman" w:hAnsi="Times New Roman" w:eastAsia="Times New Roman"/>
+          <w:b/>
+          <w:sz w:val="24"/>
+        </w:rPr>
+        <w:t>c. Pengertian dan Tujuan Manajemen Reputasi</w:t>
+      </w:r>
+    </w:p>
+    <w:p>
+      <w:pPr>
+        <w:spacing w:line="360" w:lineRule="auto" w:after="120" w:before="0"/>
+        <w:ind w:firstLine="720"/>
+        <w:jc w:val="both"/>
+      </w:pPr>
+      <w:r>
+        <w:rPr>
+          <w:rFonts w:ascii="Times New Roman" w:hAnsi="Times New Roman" w:eastAsia="Times New Roman"/>
+          <w:b w:val="0"/>
+          <w:sz w:val="24"/>
+        </w:rPr>
+        <w:t>Manajemen reputasi (</w:t>
+      </w:r>
+      <w:r>
+        <w:rPr>
+          <w:rFonts w:ascii="Times New Roman" w:hAnsi="Times New Roman" w:eastAsia="Times New Roman"/>
+          <w:b w:val="0"/>
+          <w:i/>
+          <w:sz w:val="24"/>
+        </w:rPr>
+        <w:t>reputation management</w:t>
+      </w:r>
+      <w:r>
+        <w:rPr>
+          <w:rFonts w:ascii="Times New Roman" w:hAnsi="Times New Roman" w:eastAsia="Times New Roman"/>
+          <w:b w:val="0"/>
+          <w:sz w:val="24"/>
+        </w:rPr>
+        <w:t>) adalah serangkaian aktivitas terencana untuk membangun, memelihara, melindungi, dan memulihkan reputasi organisasi. Şirzad (2022) menempatkan manajemen reputasi sebagai salah satu fungsi utama kehumasan yang bertujuan mengelola hubungan organisasi dengan khalayaknya. Van Riel dan Fombrun (2007) menekankan bahwa manajemen reputasi yang efektif menuntut komunikasi yang terkoordinasi dan konsisten guna menghasilkan modal reputasi (</w:t>
+      </w:r>
+      <w:r>
+        <w:rPr>
+          <w:rFonts w:ascii="Times New Roman" w:hAnsi="Times New Roman" w:eastAsia="Times New Roman"/>
+          <w:b w:val="0"/>
+          <w:i/>
+          <w:sz w:val="24"/>
+        </w:rPr>
+        <w:t>reputational capital</w:t>
+      </w:r>
+      <w:r>
+        <w:rPr>
+          <w:rFonts w:ascii="Times New Roman" w:hAnsi="Times New Roman" w:eastAsia="Times New Roman"/>
+          <w:b w:val="0"/>
+          <w:sz w:val="24"/>
+        </w:rPr>
+        <w:t>). Lee (2022) menambahkan bahwa tujuan utama manajemen reputasi adalah membangun kepercayaan dan dukungan pemangku kepentingan yang menjadi modal keberlangsungan organisasi.</w:t>
+      </w:r>
+    </w:p>
+    <w:p>
+      <w:pPr>
+        <w:spacing w:line="360" w:lineRule="auto" w:after="120" w:before="40"/>
+        <w:ind w:firstLine="720"/>
+        <w:jc w:val="both"/>
+      </w:pPr>
+      <w:r>
+        <w:rPr>
+          <w:rFonts w:ascii="Times New Roman" w:hAnsi="Times New Roman" w:eastAsia="Times New Roman"/>
+          <w:b/>
+          <w:i/>
+          <w:sz w:val="24"/>
+        </w:rPr>
+        <w:t xml:space="preserve">Sintesis. </w:t>
+      </w:r>
+      <w:r>
+        <w:rPr>
+          <w:rFonts w:ascii="Times New Roman" w:hAnsi="Times New Roman" w:eastAsia="Times New Roman"/>
+          <w:b w:val="0"/>
+          <w:sz w:val="24"/>
+        </w:rPr>
+        <w:t>Dengan demikian, manajemen reputasi dalam penelitian ini dipahami sebagai upaya sekolah yang dilakukan secara sengaja, terencana, dan berkelanjutan untuk membentuk, memelihara, dan melindungi penilaian positif pemangku kepentingan, dengan tujuan memperoleh kepercayaan, dukungan, dan loyalitas wali murid serta masyarakat.</w:t>
+      </w:r>
+    </w:p>
+    <w:p>
+      <w:pPr>
+        <w:spacing w:line="360" w:lineRule="auto" w:before="40" w:after="40"/>
+        <w:ind w:left="850"/>
+        <w:jc w:val="left"/>
+      </w:pPr>
+      <w:r>
+        <w:rPr>
+          <w:rFonts w:ascii="Times New Roman" w:hAnsi="Times New Roman" w:eastAsia="Times New Roman"/>
+          <w:b/>
+          <w:sz w:val="24"/>
+        </w:rPr>
+        <w:t>d. Tahapan Manajemen Reputasi</w:t>
+      </w:r>
+    </w:p>
+    <w:p>
+      <w:pPr>
+        <w:spacing w:line="360" w:lineRule="auto" w:after="120" w:before="0"/>
+        <w:ind w:firstLine="720"/>
+        <w:jc w:val="both"/>
+      </w:pPr>
+      <w:r>
+        <w:rPr>
+          <w:rFonts w:ascii="Times New Roman" w:hAnsi="Times New Roman" w:eastAsia="Times New Roman"/>
+          <w:b w:val="0"/>
+          <w:sz w:val="24"/>
+        </w:rPr>
+        <w:t>Secara prosedural, manajemen reputasi berlangsung melalui beberapa tahap, yaitu perencanaan (identifikasi pemangku kepentingan, analisis persepsi, dan penetapan tujuan reputasi), pelaksanaan (komunikasi, pelayanan, program unggulan, serta pengelolaan media), serta pemantauan dan evaluasi (pengukuran reputasi dan manajemen krisis). Rayhan dan Muksin (2025) memperlihatkan praktik perencanaan dan pelaksanaan melalui pemantauan media (</w:t>
+      </w:r>
+      <w:r>
+        <w:rPr>
+          <w:rFonts w:ascii="Times New Roman" w:hAnsi="Times New Roman" w:eastAsia="Times New Roman"/>
+          <w:b w:val="0"/>
+          <w:i/>
+          <w:sz w:val="24"/>
+        </w:rPr>
+        <w:t>media monitoring</w:t>
+      </w:r>
+      <w:r>
+        <w:rPr>
+          <w:rFonts w:ascii="Times New Roman" w:hAnsi="Times New Roman" w:eastAsia="Times New Roman"/>
+          <w:b w:val="0"/>
+          <w:sz w:val="24"/>
+        </w:rPr>
+        <w:t>) dan penyimakan media (</w:t>
+      </w:r>
+      <w:r>
+        <w:rPr>
+          <w:rFonts w:ascii="Times New Roman" w:hAnsi="Times New Roman" w:eastAsia="Times New Roman"/>
+          <w:b w:val="0"/>
+          <w:i/>
+          <w:sz w:val="24"/>
+        </w:rPr>
+        <w:t>media listening</w:t>
+      </w:r>
+      <w:r>
+        <w:rPr>
+          <w:rFonts w:ascii="Times New Roman" w:hAnsi="Times New Roman" w:eastAsia="Times New Roman"/>
+          <w:b w:val="0"/>
+          <w:sz w:val="24"/>
+        </w:rPr>
+        <w:t>), sementara Batu dan Yuningsih (2022) menunjukkan peran program tanggung jawab sosial pada tahap pelaksanaan. Pada tahap evaluasi dan pemulihan, Seyferth dan Chung (2025) menegaskan pentingnya transparansi dan kejujuran dalam menghadapi krisis untuk mempertahankan reputasi.</w:t>
+      </w:r>
+    </w:p>
+    <w:p>
+      <w:pPr>
+        <w:spacing w:line="360" w:lineRule="auto" w:after="120" w:before="40"/>
+        <w:ind w:firstLine="720"/>
+        <w:jc w:val="both"/>
+      </w:pPr>
+      <w:r>
+        <w:rPr>
+          <w:rFonts w:ascii="Times New Roman" w:hAnsi="Times New Roman" w:eastAsia="Times New Roman"/>
+          <w:b/>
+          <w:i/>
+          <w:sz w:val="24"/>
+        </w:rPr>
+        <w:t xml:space="preserve">Sintesis. </w:t>
+      </w:r>
+      <w:r>
+        <w:rPr>
+          <w:rFonts w:ascii="Times New Roman" w:hAnsi="Times New Roman" w:eastAsia="Times New Roman"/>
+          <w:b w:val="0"/>
+          <w:sz w:val="24"/>
+        </w:rPr>
+        <w:t>Berdasarkan uraian tersebut, tahapan manajemen reputasi yang digunakan sebagai kerangka analisis penelitian ini meliputi tiga tahap, yaitu perencanaan, pelaksanaan, serta pemantauan dan evaluasi. Ketiga tahap inilah yang ditelusuri pada strategi manajemen reputasi SD Muhammadiyah Condongcatur.</w:t>
+      </w:r>
+    </w:p>
+    <w:p>
+      <w:pPr>
+        <w:spacing w:line="360" w:lineRule="auto" w:before="40" w:after="40"/>
+        <w:ind w:left="850"/>
+        <w:jc w:val="left"/>
+      </w:pPr>
+      <w:r>
+        <w:rPr>
+          <w:rFonts w:ascii="Times New Roman" w:hAnsi="Times New Roman" w:eastAsia="Times New Roman"/>
+          <w:b/>
+          <w:sz w:val="24"/>
+        </w:rPr>
+        <w:t>e. Strategi Manajemen Reputasi pada Era Digital</w:t>
+      </w:r>
+    </w:p>
+    <w:p>
+      <w:pPr>
+        <w:spacing w:line="360" w:lineRule="auto" w:after="120" w:before="0"/>
+        <w:ind w:firstLine="720"/>
+        <w:jc w:val="both"/>
+      </w:pPr>
+      <w:r>
+        <w:rPr>
+          <w:rFonts w:ascii="Times New Roman" w:hAnsi="Times New Roman" w:eastAsia="Times New Roman"/>
+          <w:b w:val="0"/>
+          <w:sz w:val="24"/>
+        </w:rPr>
+        <w:t>Perkembangan teknologi informasi mengubah cara reputasi terbentuk dan dikelola. Peco-Torres et al. (2023) menemukan bahwa strategi pengelolaan reputasi daring (</w:t>
+      </w:r>
+      <w:r>
+        <w:rPr>
+          <w:rFonts w:ascii="Times New Roman" w:hAnsi="Times New Roman" w:eastAsia="Times New Roman"/>
+          <w:b w:val="0"/>
+          <w:i/>
+          <w:sz w:val="24"/>
+        </w:rPr>
+        <w:t>online reputation management</w:t>
+      </w:r>
+      <w:r>
+        <w:rPr>
+          <w:rFonts w:ascii="Times New Roman" w:hAnsi="Times New Roman" w:eastAsia="Times New Roman"/>
+          <w:b w:val="0"/>
+          <w:sz w:val="24"/>
+        </w:rPr>
+        <w:t>) berpengaruh positif terhadap reputasi yang dipersepsikan publik. Sebaliknya, Perera et al. (2022) memperingatkan adanya risiko kerusakan reputasi (</w:t>
+      </w:r>
+      <w:r>
+        <w:rPr>
+          <w:rFonts w:ascii="Times New Roman" w:hAnsi="Times New Roman" w:eastAsia="Times New Roman"/>
+          <w:b w:val="0"/>
+          <w:i/>
+          <w:sz w:val="24"/>
+        </w:rPr>
+        <w:t>reputational damage</w:t>
+      </w:r>
+      <w:r>
+        <w:rPr>
+          <w:rFonts w:ascii="Times New Roman" w:hAnsi="Times New Roman" w:eastAsia="Times New Roman"/>
+          <w:b w:val="0"/>
+          <w:sz w:val="24"/>
+        </w:rPr>
+        <w:t xml:space="preserve">) akibat serangan siber sehingga organisasi perlu menyiapkan strategi mitigasi. Osypova dan Pokotylo (2024) menegaskan bahwa pemaduan </w:t>
+      </w:r>
+      <w:r>
+        <w:rPr>
+          <w:rFonts w:ascii="Times New Roman" w:hAnsi="Times New Roman" w:eastAsia="Times New Roman"/>
+          <w:b w:val="0"/>
+          <w:i/>
+          <w:sz w:val="24"/>
+        </w:rPr>
+        <w:t>branding</w:t>
+      </w:r>
+      <w:r>
+        <w:rPr>
+          <w:rFonts w:ascii="Times New Roman" w:hAnsi="Times New Roman" w:eastAsia="Times New Roman"/>
+          <w:b w:val="0"/>
+          <w:sz w:val="24"/>
+        </w:rPr>
+        <w:t xml:space="preserve"> dan manajemen reputasi membangun kepercayaan jangka panjang.</w:t>
+      </w:r>
+    </w:p>
+    <w:p>
+      <w:pPr>
+        <w:spacing w:line="360" w:lineRule="auto" w:after="120" w:before="40"/>
+        <w:ind w:firstLine="720"/>
+        <w:jc w:val="both"/>
+      </w:pPr>
+      <w:r>
+        <w:rPr>
+          <w:rFonts w:ascii="Times New Roman" w:hAnsi="Times New Roman" w:eastAsia="Times New Roman"/>
+          <w:b/>
+          <w:i/>
+          <w:sz w:val="24"/>
+        </w:rPr>
+        <w:t xml:space="preserve">Sintesis. </w:t>
+      </w:r>
+      <w:r>
+        <w:rPr>
+          <w:rFonts w:ascii="Times New Roman" w:hAnsi="Times New Roman" w:eastAsia="Times New Roman"/>
+          <w:b w:val="0"/>
+          <w:sz w:val="24"/>
+        </w:rPr>
+        <w:t>Sintesis dari pembahasan ini menunjukkan bahwa strategi manajemen reputasi pada era digital menuntut sekolah untuk mengelola kanal komunikasi daring secara aktif, menjaga konsistensi pesan, sekaligus mengantisipasi risiko reputasi. Hal ini relevan bagi sekolah dalam membangun citra dan kepercayaan di tengah keterbukaan informasi.</w:t>
       </w:r>
     </w:p>
     <w:p>
@@ -1084,28 +1718,28 @@
           <w:b/>
           <w:sz w:val="24"/>
         </w:rPr>
-        <w:t>2. Manfaat Praktis</w:t>
+        <w:t>2. Keunggulan Kompetitif</w:t>
       </w:r>
     </w:p>
     <w:p>
       <w:pPr>
-        <w:spacing w:line="360" w:lineRule="auto" w:after="80"/>
-        <w:ind w:left="850" w:hanging="425"/>
-        <w:jc w:val="both"/>
-      </w:pPr>
-      <w:r>
-        <w:rPr>
-          <w:rFonts w:ascii="Times New Roman" w:hAnsi="Times New Roman" w:eastAsia="Times New Roman"/>
-          <w:b w:val="0"/>
-          <w:sz w:val="24"/>
-        </w:rPr>
-        <w:t>a. Bagi sekolah, hasil penelitian dapat menjadi bahan refleksi dan rujukan dalam merumuskan strategi manajemen reputasi yang efektif untuk memperkuat keunggulan kompetitif.</w:t>
+        <w:spacing w:line="360" w:lineRule="auto" w:before="40" w:after="40"/>
+        <w:ind w:left="850"/>
+        <w:jc w:val="left"/>
+      </w:pPr>
+      <w:r>
+        <w:rPr>
+          <w:rFonts w:ascii="Times New Roman" w:hAnsi="Times New Roman" w:eastAsia="Times New Roman"/>
+          <w:b/>
+          <w:sz w:val="24"/>
+        </w:rPr>
+        <w:t>a. Pengertian Keunggulan Kompetitif</w:t>
       </w:r>
     </w:p>
     <w:p>
       <w:pPr>
-        <w:spacing w:line="360" w:lineRule="auto" w:after="80"/>
-        <w:ind w:left="850" w:hanging="425"/>
+        <w:spacing w:line="360" w:lineRule="auto" w:after="120" w:before="0"/>
+        <w:ind w:firstLine="720"/>
         <w:jc w:val="both"/>
       </w:pPr>
       <w:r>
@@ -1114,79 +1748,262 @@
           <w:b w:val="0"/>
           <w:sz w:val="24"/>
         </w:rPr>
-        <w:t>b. Bagi kepala sekolah dan tim humas, penelitian ini memberikan gambaran praktik pengelolaan reputasi yang dapat diadaptasi sesuai konteks masing-masing lembaga.</w:t>
+        <w:t>Keunggulan kompetitif (</w:t>
+      </w:r>
+      <w:r>
+        <w:rPr>
+          <w:rFonts w:ascii="Times New Roman" w:hAnsi="Times New Roman" w:eastAsia="Times New Roman"/>
+          <w:b w:val="0"/>
+          <w:i/>
+          <w:sz w:val="24"/>
+        </w:rPr>
+        <w:t>competitive advantage</w:t>
+      </w:r>
+      <w:r>
+        <w:rPr>
+          <w:rFonts w:ascii="Times New Roman" w:hAnsi="Times New Roman" w:eastAsia="Times New Roman"/>
+          <w:b w:val="0"/>
+          <w:sz w:val="24"/>
+        </w:rPr>
+        <w:t>) merujuk pada kemampuan organisasi menciptakan nilai (</w:t>
+      </w:r>
+      <w:r>
+        <w:rPr>
+          <w:rFonts w:ascii="Times New Roman" w:hAnsi="Times New Roman" w:eastAsia="Times New Roman"/>
+          <w:b w:val="0"/>
+          <w:i/>
+          <w:sz w:val="24"/>
+        </w:rPr>
+        <w:t>value</w:t>
+      </w:r>
+      <w:r>
+        <w:rPr>
+          <w:rFonts w:ascii="Times New Roman" w:hAnsi="Times New Roman" w:eastAsia="Times New Roman"/>
+          <w:b w:val="0"/>
+          <w:sz w:val="24"/>
+        </w:rPr>
+        <w:t>) yang lebih unggul dibandingkan pesaing sehingga menghasilkan kinerja superior dan posisi yang sulit ditandingi. Porter (1985) memandang keunggulan kompetitif sebagai inti dari kinerja organisasi dalam pasar yang kompetitif, sementara Farida dan Setiawan (2022) menegaskan bahwa keunggulan kompetitif merupakan hasil dari strategi bisnis dan inovasi yang membuat organisasi lebih unggul dalam memenuhi kebutuhan pelanggan.</w:t>
       </w:r>
     </w:p>
     <w:p>
       <w:pPr>
-        <w:spacing w:line="360" w:lineRule="auto" w:after="80"/>
-        <w:ind w:left="850" w:hanging="425"/>
+        <w:spacing w:line="360" w:lineRule="auto" w:after="120" w:before="40"/>
+        <w:ind w:firstLine="720"/>
         <w:jc w:val="both"/>
       </w:pPr>
       <w:r>
         <w:rPr>
           <w:rFonts w:ascii="Times New Roman" w:hAnsi="Times New Roman" w:eastAsia="Times New Roman"/>
-          <w:b w:val="0"/>
-          <w:sz w:val="24"/>
-        </w:rPr>
-        <w:t>c. Bagi pemangku kepentingan pendidikan (Persyarikatan Muhammadiyah, dinas pendidikan, dan masyarakat), penelitian ini memberikan informasi mengenai praktik baik (</w:t>
-      </w:r>
-      <w:r>
-        <w:rPr>
-          <w:rFonts w:ascii="Times New Roman" w:hAnsi="Times New Roman" w:eastAsia="Times New Roman"/>
-          <w:b w:val="0"/>
+          <w:b/>
           <w:i/>
           <w:sz w:val="24"/>
         </w:rPr>
-        <w:t>best practice</w:t>
-      </w:r>
-      <w:r>
-        <w:rPr>
-          <w:rFonts w:ascii="Times New Roman" w:hAnsi="Times New Roman" w:eastAsia="Times New Roman"/>
-          <w:b w:val="0"/>
-          <w:sz w:val="24"/>
-        </w:rPr>
-        <w:t>) pengelolaan reputasi sekolah dasar.</w:t>
+        <w:t xml:space="preserve">Sintesis. </w:t>
+      </w:r>
+      <w:r>
+        <w:rPr>
+          <w:rFonts w:ascii="Times New Roman" w:hAnsi="Times New Roman" w:eastAsia="Times New Roman"/>
+          <w:b w:val="0"/>
+          <w:sz w:val="24"/>
+        </w:rPr>
+        <w:t>Berdasarkan pendapat tersebut, keunggulan kompetitif dalam penelitian ini dimaknai sebagai kemampuan sekolah untuk menghadirkan nilai dan layanan yang lebih unggul daripada sekolah pesaing sehingga mampu menarik dan mempertahankan peserta didik serta kepercayaan pemangku kepentingan.</w:t>
       </w:r>
     </w:p>
     <w:p>
       <w:pPr>
-        <w:spacing w:line="360" w:lineRule="auto" w:after="80"/>
-        <w:ind w:left="850" w:hanging="425"/>
-        <w:jc w:val="both"/>
-      </w:pPr>
-      <w:r>
-        <w:rPr>
-          <w:rFonts w:ascii="Times New Roman" w:hAnsi="Times New Roman" w:eastAsia="Times New Roman"/>
-          <w:b w:val="0"/>
-          <w:sz w:val="24"/>
-        </w:rPr>
-        <w:t>d. Bagi peneliti lain, hasil penelitian dapat menjadi acuan untuk pengembangan penelitian lanjutan dengan fokus, pendekatan, atau latar yang berbeda.</w:t>
+        <w:spacing w:line="360" w:lineRule="auto" w:before="40" w:after="40"/>
+        <w:ind w:left="850"/>
+        <w:jc w:val="left"/>
+      </w:pPr>
+      <w:r>
+        <w:rPr>
+          <w:rFonts w:ascii="Times New Roman" w:hAnsi="Times New Roman" w:eastAsia="Times New Roman"/>
+          <w:b/>
+          <w:sz w:val="24"/>
+        </w:rPr>
+        <w:t>b. Teori dan Pendekatan Keunggulan Kompetitif</w:t>
       </w:r>
     </w:p>
     <w:p>
-      <w:r>
-        <w:br w:type="page"/>
+      <w:pPr>
+        <w:spacing w:line="360" w:lineRule="auto" w:after="120" w:before="0"/>
+        <w:ind w:firstLine="720"/>
+        <w:jc w:val="both"/>
+      </w:pPr>
+      <w:r>
+        <w:rPr>
+          <w:rFonts w:ascii="Times New Roman" w:hAnsi="Times New Roman" w:eastAsia="Times New Roman"/>
+          <w:b w:val="0"/>
+          <w:sz w:val="24"/>
+        </w:rPr>
+        <w:t>Terdapat dua pendekatan utama dalam menjelaskan sumber keunggulan kompetitif. Pertama, pendekatan strategi generik Porter (1985) yang menekankan kepemimpinan biaya (</w:t>
+      </w:r>
+      <w:r>
+        <w:rPr>
+          <w:rFonts w:ascii="Times New Roman" w:hAnsi="Times New Roman" w:eastAsia="Times New Roman"/>
+          <w:b w:val="0"/>
+          <w:i/>
+          <w:sz w:val="24"/>
+        </w:rPr>
+        <w:t>cost leadership</w:t>
+      </w:r>
+      <w:r>
+        <w:rPr>
+          <w:rFonts w:ascii="Times New Roman" w:hAnsi="Times New Roman" w:eastAsia="Times New Roman"/>
+          <w:b w:val="0"/>
+          <w:sz w:val="24"/>
+        </w:rPr>
+        <w:t>) dan diferensiasi (</w:t>
+      </w:r>
+      <w:r>
+        <w:rPr>
+          <w:rFonts w:ascii="Times New Roman" w:hAnsi="Times New Roman" w:eastAsia="Times New Roman"/>
+          <w:b w:val="0"/>
+          <w:i/>
+          <w:sz w:val="24"/>
+        </w:rPr>
+        <w:t>differentiation</w:t>
+      </w:r>
+      <w:r>
+        <w:rPr>
+          <w:rFonts w:ascii="Times New Roman" w:hAnsi="Times New Roman" w:eastAsia="Times New Roman"/>
+          <w:b w:val="0"/>
+          <w:sz w:val="24"/>
+        </w:rPr>
+        <w:t>) yang dapat difokuskan pada segmen tertentu (</w:t>
+      </w:r>
+      <w:r>
+        <w:rPr>
+          <w:rFonts w:ascii="Times New Roman" w:hAnsi="Times New Roman" w:eastAsia="Times New Roman"/>
+          <w:b w:val="0"/>
+          <w:i/>
+          <w:sz w:val="24"/>
+        </w:rPr>
+        <w:t>focus</w:t>
+      </w:r>
+      <w:r>
+        <w:rPr>
+          <w:rFonts w:ascii="Times New Roman" w:hAnsi="Times New Roman" w:eastAsia="Times New Roman"/>
+          <w:b w:val="0"/>
+          <w:sz w:val="24"/>
+        </w:rPr>
+        <w:t>). Kedua, pandangan berbasis sumber daya (</w:t>
+      </w:r>
+      <w:r>
+        <w:rPr>
+          <w:rFonts w:ascii="Times New Roman" w:hAnsi="Times New Roman" w:eastAsia="Times New Roman"/>
+          <w:b w:val="0"/>
+          <w:i/>
+          <w:sz w:val="24"/>
+        </w:rPr>
+        <w:t>resource-based view</w:t>
+      </w:r>
+      <w:r>
+        <w:rPr>
+          <w:rFonts w:ascii="Times New Roman" w:hAnsi="Times New Roman" w:eastAsia="Times New Roman"/>
+          <w:b w:val="0"/>
+          <w:sz w:val="24"/>
+        </w:rPr>
+        <w:t>) yang menyatakan bahwa keunggulan kompetitif berkelanjutan bersumber dari sumber daya dan kapabilitas yang bernilai, langka, sukar ditiru, dan tak tergantikan (Barney, 1991; Assensoh-Kodua, 2019). Perspektif ini diperkaya oleh konsep kapabilitas dinamis (</w:t>
+      </w:r>
+      <w:r>
+        <w:rPr>
+          <w:rFonts w:ascii="Times New Roman" w:hAnsi="Times New Roman" w:eastAsia="Times New Roman"/>
+          <w:b w:val="0"/>
+          <w:i/>
+          <w:sz w:val="24"/>
+        </w:rPr>
+        <w:t>dynamic capabilities</w:t>
+      </w:r>
+      <w:r>
+        <w:rPr>
+          <w:rFonts w:ascii="Times New Roman" w:hAnsi="Times New Roman" w:eastAsia="Times New Roman"/>
+          <w:b w:val="0"/>
+          <w:sz w:val="24"/>
+        </w:rPr>
+        <w:t>) (Bari et al., 2024) serta pandangan berbasis jaringan (</w:t>
+      </w:r>
+      <w:r>
+        <w:rPr>
+          <w:rFonts w:ascii="Times New Roman" w:hAnsi="Times New Roman" w:eastAsia="Times New Roman"/>
+          <w:b w:val="0"/>
+          <w:i/>
+          <w:sz w:val="24"/>
+        </w:rPr>
+        <w:t>network-centric view</w:t>
+      </w:r>
+      <w:r>
+        <w:rPr>
+          <w:rFonts w:ascii="Times New Roman" w:hAnsi="Times New Roman" w:eastAsia="Times New Roman"/>
+          <w:b w:val="0"/>
+          <w:sz w:val="24"/>
+        </w:rPr>
+        <w:t>) pada ekonomi digital (Koch &amp; Windsperger, 2017).</w:t>
       </w:r>
     </w:p>
     <w:p>
       <w:pPr>
-        <w:spacing w:line="360" w:lineRule="auto" w:after="0"/>
-        <w:jc w:val="center"/>
+        <w:spacing w:line="360" w:lineRule="auto" w:after="120" w:before="40"/>
+        <w:ind w:firstLine="720"/>
+        <w:jc w:val="both"/>
       </w:pPr>
       <w:r>
         <w:rPr>
           <w:rFonts w:ascii="Times New Roman" w:hAnsi="Times New Roman" w:eastAsia="Times New Roman"/>
           <w:b/>
-          <w:sz w:val="24"/>
-        </w:rPr>
-        <w:t>BAB II</w:t>
+          <w:i/>
+          <w:sz w:val="24"/>
+        </w:rPr>
+        <w:t xml:space="preserve">Sintesis. </w:t>
+      </w:r>
+      <w:r>
+        <w:rPr>
+          <w:rFonts w:ascii="Times New Roman" w:hAnsi="Times New Roman" w:eastAsia="Times New Roman"/>
+          <w:b w:val="0"/>
+          <w:sz w:val="24"/>
+        </w:rPr>
+        <w:t>Dari kedua pendekatan tersebut dapat disintesiskan bahwa reputasi merupakan sumber daya tak berwujud (</w:t>
+      </w:r>
+      <w:r>
+        <w:rPr>
+          <w:rFonts w:ascii="Times New Roman" w:hAnsi="Times New Roman" w:eastAsia="Times New Roman"/>
+          <w:b w:val="0"/>
+          <w:i/>
+          <w:sz w:val="24"/>
+        </w:rPr>
+        <w:t>intangible</w:t>
+      </w:r>
+      <w:r>
+        <w:rPr>
+          <w:rFonts w:ascii="Times New Roman" w:hAnsi="Times New Roman" w:eastAsia="Times New Roman"/>
+          <w:b w:val="0"/>
+          <w:sz w:val="24"/>
+        </w:rPr>
+        <w:t xml:space="preserve">) yang bernilai, langka, dan sukar ditiru sehingga, dalam kerangka </w:t>
+      </w:r>
+      <w:r>
+        <w:rPr>
+          <w:rFonts w:ascii="Times New Roman" w:hAnsi="Times New Roman" w:eastAsia="Times New Roman"/>
+          <w:b w:val="0"/>
+          <w:i/>
+          <w:sz w:val="24"/>
+        </w:rPr>
+        <w:t>resource-based view</w:t>
+      </w:r>
+      <w:r>
+        <w:rPr>
+          <w:rFonts w:ascii="Times New Roman" w:hAnsi="Times New Roman" w:eastAsia="Times New Roman"/>
+          <w:b w:val="0"/>
+          <w:sz w:val="24"/>
+        </w:rPr>
+        <w:t>, layak diposisikan sebagai sumber keunggulan kompetitif sekaligus bentuk strategi diferensiasi bagi sekolah.</w:t>
       </w:r>
     </w:p>
     <w:p>
       <w:pPr>
-        <w:spacing w:line="360" w:lineRule="auto" w:after="240"/>
-        <w:jc w:val="center"/>
+        <w:spacing w:line="360" w:lineRule="auto" w:before="40" w:after="40"/>
+        <w:ind w:left="850"/>
+        <w:jc w:val="left"/>
       </w:pPr>
       <w:r>
         <w:rPr>
@@ -1194,21 +2011,80 @@
           <w:b/>
           <w:sz w:val="24"/>
         </w:rPr>
-        <w:t>KAJIAN PUSTAKA</w:t>
+        <w:t>c. Sumber dan Indikator Keunggulan Kompetitif</w:t>
       </w:r>
     </w:p>
     <w:p>
       <w:pPr>
-        <w:spacing w:line="360" w:lineRule="auto" w:before="120" w:after="80"/>
-        <w:jc w:val="left"/>
+        <w:spacing w:line="360" w:lineRule="auto" w:after="120" w:before="0"/>
+        <w:ind w:firstLine="720"/>
+        <w:jc w:val="both"/>
+      </w:pPr>
+      <w:r>
+        <w:rPr>
+          <w:rFonts w:ascii="Times New Roman" w:hAnsi="Times New Roman" w:eastAsia="Times New Roman"/>
+          <w:b w:val="0"/>
+          <w:sz w:val="24"/>
+        </w:rPr>
+        <w:t xml:space="preserve">Sejumlah penelitian empiris mengidentifikasi beragam sumber keunggulan kompetitif, antara lain inovasi dan kinerja (Farida &amp; Setiawan, 2022), orientasi pasar (Puspaningrum, 2020; Udriyah et al., 2019), inovasi produk dan </w:t>
+      </w:r>
+      <w:r>
+        <w:rPr>
+          <w:rFonts w:ascii="Times New Roman" w:hAnsi="Times New Roman" w:eastAsia="Times New Roman"/>
+          <w:b w:val="0"/>
+          <w:i/>
+          <w:sz w:val="24"/>
+        </w:rPr>
+        <w:t>market driving</w:t>
+      </w:r>
+      <w:r>
+        <w:rPr>
+          <w:rFonts w:ascii="Times New Roman" w:hAnsi="Times New Roman" w:eastAsia="Times New Roman"/>
+          <w:b w:val="0"/>
+          <w:sz w:val="24"/>
+        </w:rPr>
+        <w:t xml:space="preserve"> (Kuncoro &amp; Suriani, 2018), kepemimpinan strategis dan manajemen pengetahuan (Mahdi &amp; Nassar, 2021), manajemen sumber daya manusia strategis (Hamadamin &amp; Atan, 2019), serta pemecahan masalah kompleks (Veríssimo et al., 2024). Indikator keunggulan kompetitif umumnya mencakup keunikan/diferensiasi, nilai bagi pelanggan, daya tarik, serta keberlanjutan yang sulit ditiru pesaing.</w:t>
+      </w:r>
+    </w:p>
+    <w:p>
+      <w:pPr>
+        <w:spacing w:line="360" w:lineRule="auto" w:after="120" w:before="40"/>
+        <w:ind w:firstLine="720"/>
+        <w:jc w:val="both"/>
       </w:pPr>
       <w:r>
         <w:rPr>
           <w:rFonts w:ascii="Times New Roman" w:hAnsi="Times New Roman" w:eastAsia="Times New Roman"/>
           <w:b/>
-          <w:sz w:val="24"/>
-        </w:rPr>
-        <w:t>A. Kajian Teori</w:t>
+          <w:i/>
+          <w:sz w:val="24"/>
+        </w:rPr>
+        <w:t xml:space="preserve">Sintesis. </w:t>
+      </w:r>
+      <w:r>
+        <w:rPr>
+          <w:rFonts w:ascii="Times New Roman" w:hAnsi="Times New Roman" w:eastAsia="Times New Roman"/>
+          <w:b w:val="0"/>
+          <w:sz w:val="24"/>
+        </w:rPr>
+        <w:t>Dengan demikian, indikator keunggulan kompetitif sekolah dalam penelitian ini dirumuskan menjadi empat, yaitu diferensiasi (keunikan), nilai bagi pemangku kepentingan, daya tarik (animo pendaftar dan loyalitas), serta keberlanjutan (</w:t>
+      </w:r>
+      <w:r>
+        <w:rPr>
+          <w:rFonts w:ascii="Times New Roman" w:hAnsi="Times New Roman" w:eastAsia="Times New Roman"/>
+          <w:b w:val="0"/>
+          <w:i/>
+          <w:sz w:val="24"/>
+        </w:rPr>
+        <w:t>sustainability</w:t>
+      </w:r>
+      <w:r>
+        <w:rPr>
+          <w:rFonts w:ascii="Times New Roman" w:hAnsi="Times New Roman" w:eastAsia="Times New Roman"/>
+          <w:b w:val="0"/>
+          <w:sz w:val="24"/>
+        </w:rPr>
+        <w:t>) yang sukar ditiru sekolah lain.</w:t>
       </w:r>
     </w:p>
     <w:p>
@@ -1223,7 +2099,22 @@
           <w:b/>
           <w:sz w:val="24"/>
         </w:rPr>
-        <w:t>1. Konsep Reputasi</w:t>
+        <w:t>3. Manajemen Reputasi dalam Memperkuat Keunggulan Kompetitif Lembaga Pendidikan</w:t>
+      </w:r>
+    </w:p>
+    <w:p>
+      <w:pPr>
+        <w:spacing w:line="360" w:lineRule="auto" w:before="40" w:after="40"/>
+        <w:ind w:left="850"/>
+        <w:jc w:val="left"/>
+      </w:pPr>
+      <w:r>
+        <w:rPr>
+          <w:rFonts w:ascii="Times New Roman" w:hAnsi="Times New Roman" w:eastAsia="Times New Roman"/>
+          <w:b/>
+          <w:sz w:val="24"/>
+        </w:rPr>
+        <w:t>a. Sekolah sebagai Organisasi Penyedia Jasa Pendidikan</w:t>
       </w:r>
     </w:p>
     <w:p>
@@ -1238,7 +2129,7 @@
           <w:b w:val="0"/>
           <w:sz w:val="24"/>
         </w:rPr>
-        <w:t>Reputasi (</w:t>
+        <w:t>Sekolah merupakan organisasi penyedia jasa yang bersaing untuk memperoleh kepercayaan publik. Hart dan Rodgers (2024) menemukan bahwa institusi pendidikan kini bersaing layaknya organisasi bisnis dan membutuhkan strategi yang jelas untuk membedakan diri. Supardi dan Herawan (2020) menunjukkan bahwa intelijen kompetitif (</w:t>
       </w:r>
       <w:r>
         <w:rPr>
@@ -1247,49 +2138,54 @@
           <w:i/>
           <w:sz w:val="24"/>
         </w:rPr>
-        <w:t>reputation</w:t>
-      </w:r>
-      <w:r>
-        <w:rPr>
-          <w:rFonts w:ascii="Times New Roman" w:hAnsi="Times New Roman" w:eastAsia="Times New Roman"/>
-          <w:b w:val="0"/>
-          <w:sz w:val="24"/>
-        </w:rPr>
-        <w:t>) merupakan konstruk multidimensi yang mencerminkan penilaian kolektif pemangku kepentingan terhadap suatu organisasi berdasarkan pengalaman langsung, komunikasi, dan perbandingan dengan organisasi lain. Fombrun (1996) mendefinisikan reputasi sebagai representasi persepsi atas tindakan masa lalu dan prospek masa depan organisasi yang menggambarkan daya tariknya bagi seluruh khalayak utama. Ravasi et al. (2018) menegaskan bahwa reputasi terbentuk melalui proses sosial-kognitif yang melibatkan interaksi antara identitas organisasi, tindakan organisasi, dan interpretasi pemangku kepentingan. Reputasi berbeda dari citra (</w:t>
-      </w:r>
-      <w:r>
-        <w:rPr>
-          <w:rFonts w:ascii="Times New Roman" w:hAnsi="Times New Roman" w:eastAsia="Times New Roman"/>
-          <w:b w:val="0"/>
+        <w:t>competitive intelligence</w:t>
+      </w:r>
+      <w:r>
+        <w:rPr>
+          <w:rFonts w:ascii="Times New Roman" w:hAnsi="Times New Roman" w:eastAsia="Times New Roman"/>
+          <w:b w:val="0"/>
+          <w:sz w:val="24"/>
+        </w:rPr>
+        <w:t>) membantu sekolah meraih keunggulan kompetitif berkelanjutan, sedangkan Asrulla et al. (2025) membuktikan pengaruh strategi diferensiasi dan keunggulan biaya melalui penciptaan nilai terhadap keunggulan kompetitif sekolah Islam terpadu.</w:t>
+      </w:r>
+    </w:p>
+    <w:p>
+      <w:pPr>
+        <w:spacing w:line="360" w:lineRule="auto" w:after="120" w:before="40"/>
+        <w:ind w:firstLine="720"/>
+        <w:jc w:val="both"/>
+      </w:pPr>
+      <w:r>
+        <w:rPr>
+          <w:rFonts w:ascii="Times New Roman" w:hAnsi="Times New Roman" w:eastAsia="Times New Roman"/>
+          <w:b/>
           <w:i/>
           <w:sz w:val="24"/>
         </w:rPr>
-        <w:t>image</w:t>
-      </w:r>
-      <w:r>
-        <w:rPr>
-          <w:rFonts w:ascii="Times New Roman" w:hAnsi="Times New Roman" w:eastAsia="Times New Roman"/>
-          <w:b w:val="0"/>
-          <w:sz w:val="24"/>
-        </w:rPr>
-        <w:t>) dan identitas (</w:t>
-      </w:r>
-      <w:r>
-        <w:rPr>
-          <w:rFonts w:ascii="Times New Roman" w:hAnsi="Times New Roman" w:eastAsia="Times New Roman"/>
-          <w:b w:val="0"/>
-          <w:i/>
-          <w:sz w:val="24"/>
-        </w:rPr>
-        <w:t>identity</w:t>
-      </w:r>
-      <w:r>
-        <w:rPr>
-          <w:rFonts w:ascii="Times New Roman" w:hAnsi="Times New Roman" w:eastAsia="Times New Roman"/>
-          <w:b w:val="0"/>
-          <w:sz w:val="24"/>
-        </w:rPr>
-        <w:t>): identitas merujuk pada karakter internal organisasi, citra adalah kesan jangka pendek yang dipersepsikan publik, sedangkan reputasi adalah penilaian yang relatif stabil dan terakumulasi dalam jangka panjang (Van Riel &amp; Fombrun, 2007).</w:t>
+        <w:t xml:space="preserve">Sintesis. </w:t>
+      </w:r>
+      <w:r>
+        <w:rPr>
+          <w:rFonts w:ascii="Times New Roman" w:hAnsi="Times New Roman" w:eastAsia="Times New Roman"/>
+          <w:b w:val="0"/>
+          <w:sz w:val="24"/>
+        </w:rPr>
+        <w:t>Sintesisnya, sekolah—termasuk sekolah dasar swasta berbasis keislaman seperti SD Muhammadiyah Condongcatur—merupakan organisasi jasa yang menghadapi persaingan nyata sehingga membutuhkan strategi untuk membangun keunggulan kompetitif, salah satunya melalui pengelolaan reputasi.</w:t>
+      </w:r>
+    </w:p>
+    <w:p>
+      <w:pPr>
+        <w:spacing w:line="360" w:lineRule="auto" w:before="40" w:after="40"/>
+        <w:ind w:left="850"/>
+        <w:jc w:val="left"/>
+      </w:pPr>
+      <w:r>
+        <w:rPr>
+          <w:rFonts w:ascii="Times New Roman" w:hAnsi="Times New Roman" w:eastAsia="Times New Roman"/>
+          <w:b/>
+          <w:sz w:val="24"/>
+        </w:rPr>
+        <w:t>b. Reputasi Sekolah sebagai Sumber Keunggulan Kompetitif</w:t>
       </w:r>
     </w:p>
     <w:p>
@@ -1304,7 +2200,7 @@
           <w:b w:val="0"/>
           <w:sz w:val="24"/>
         </w:rPr>
-        <w:t>Overman et al. (2020) mengembangkan instrumen pengukuran reputasi multidimensi yang membedakan subdimensi reputasi, seperti dimensi kinerja, moral, prosedural, dan teknis. Pada konteks konsumen, Tay et al. (2020) mengidentifikasi determinan reputasi yang meliputi kualitas layanan, tanggung jawab sosial, dan komunikasi. Agarwal dan Osiyevskyy (2021) menambahkan tiga faset reputasi organisasi bagi pelanggan, yakni efektivitas produk dan layanan (</w:t>
+        <w:t>Reputasi dan keunggulan kompetitif memiliki keterkaitan yang erat. Gao et al. (2017) menjelaskan bahwa reputasi menjadi penopang kelangsungan hidup jangka panjang organisasi, terutama dalam lingkungan dengan kekosongan kelembagaan (</w:t>
       </w:r>
       <w:r>
         <w:rPr>
@@ -1313,15 +2209,15 @@
           <w:i/>
           <w:sz w:val="24"/>
         </w:rPr>
-        <w:t>product and service efficacy</w:t>
-      </w:r>
-      <w:r>
-        <w:rPr>
-          <w:rFonts w:ascii="Times New Roman" w:hAnsi="Times New Roman" w:eastAsia="Times New Roman"/>
-          <w:b w:val="0"/>
-          <w:sz w:val="24"/>
-        </w:rPr>
-        <w:t>), keunggulan pasar (</w:t>
+        <w:t>institutional voids</w:t>
+      </w:r>
+      <w:r>
+        <w:rPr>
+          <w:rFonts w:ascii="Times New Roman" w:hAnsi="Times New Roman" w:eastAsia="Times New Roman"/>
+          <w:b w:val="0"/>
+          <w:sz w:val="24"/>
+        </w:rPr>
+        <w:t>). Pada lembaga pendidikan, Warta et al. (2024) menemukan bahwa manajemen reputasi sekolah merupakan kunci keberlanjutan institusi (</w:t>
       </w:r>
       <w:r>
         <w:rPr>
@@ -1330,15 +2226,15 @@
           <w:i/>
           <w:sz w:val="24"/>
         </w:rPr>
-        <w:t>market prominence</w:t>
-      </w:r>
-      <w:r>
-        <w:rPr>
-          <w:rFonts w:ascii="Times New Roman" w:hAnsi="Times New Roman" w:eastAsia="Times New Roman"/>
-          <w:b w:val="0"/>
-          <w:sz w:val="24"/>
-        </w:rPr>
-        <w:t>), dan etika sosial (</w:t>
+        <w:t>institutional sustainability</w:t>
+      </w:r>
+      <w:r>
+        <w:rPr>
+          <w:rFonts w:ascii="Times New Roman" w:hAnsi="Times New Roman" w:eastAsia="Times New Roman"/>
+          <w:b w:val="0"/>
+          <w:sz w:val="24"/>
+        </w:rPr>
+        <w:t>) dan pencapaian predikat unggul, sedangkan Hidalgo-Peñate et al. (2024) membuktikan bahwa pemanfaatan sumber daya teknologi memperkuat kapabilitas dinamis yang meningkatkan reputasi sekolah. Sahrul et al. (2024) menempatkan citra sekolah (</w:t>
       </w:r>
       <w:r>
         <w:rPr>
@@ -1347,15 +2243,15 @@
           <w:i/>
           <w:sz w:val="24"/>
         </w:rPr>
-        <w:t>societal ethicality</w:t>
-      </w:r>
-      <w:r>
-        <w:rPr>
-          <w:rFonts w:ascii="Times New Roman" w:hAnsi="Times New Roman" w:eastAsia="Times New Roman"/>
-          <w:b w:val="0"/>
-          <w:sz w:val="24"/>
-        </w:rPr>
-        <w:t xml:space="preserve">). Van der Waldt (2022) merinci variabel-variabel reputasi yang mencakup identitas, citra, </w:t>
+        <w:t>school image</w:t>
+      </w:r>
+      <w:r>
+        <w:rPr>
+          <w:rFonts w:ascii="Times New Roman" w:hAnsi="Times New Roman" w:eastAsia="Times New Roman"/>
+          <w:b w:val="0"/>
+          <w:sz w:val="24"/>
+        </w:rPr>
+        <w:t xml:space="preserve">) sebagai variabel </w:t>
       </w:r>
       <w:r>
         <w:rPr>
@@ -1364,38 +2260,45 @@
           <w:i/>
           <w:sz w:val="24"/>
         </w:rPr>
-        <w:t>branding</w:t>
-      </w:r>
-      <w:r>
-        <w:rPr>
-          <w:rFonts w:ascii="Times New Roman" w:hAnsi="Times New Roman" w:eastAsia="Times New Roman"/>
-          <w:b w:val="0"/>
-          <w:sz w:val="24"/>
-        </w:rPr>
-        <w:t>, kepribadian, perilaku, budaya, etika, dan penuturan kisah (</w:t>
-      </w:r>
-      <w:r>
-        <w:rPr>
-          <w:rFonts w:ascii="Times New Roman" w:hAnsi="Times New Roman" w:eastAsia="Times New Roman"/>
-          <w:b w:val="0"/>
-          <w:i/>
-          <w:sz w:val="24"/>
-        </w:rPr>
-        <w:t>storytelling</w:t>
-      </w:r>
-      <w:r>
-        <w:rPr>
-          <w:rFonts w:ascii="Times New Roman" w:hAnsi="Times New Roman" w:eastAsia="Times New Roman"/>
-          <w:b w:val="0"/>
-          <w:sz w:val="24"/>
-        </w:rPr>
-        <w:t>). Pemahaman ini menunjukkan bahwa reputasi bersifat kompleks dan harus dikelola secara menyeluruh.</w:t>
+        <w:t>intervening</w:t>
+      </w:r>
+      <w:r>
+        <w:rPr>
+          <w:rFonts w:ascii="Times New Roman" w:hAnsi="Times New Roman" w:eastAsia="Times New Roman"/>
+          <w:b w:val="0"/>
+          <w:sz w:val="24"/>
+        </w:rPr>
+        <w:t xml:space="preserve"> menuju keunggulan kompetitif berkelanjutan, dan Hifza serta Aslan (2020) merumuskan model pengembangan keunggulan kompetitif pada lembaga pendidikan Islam swasta.</w:t>
       </w:r>
     </w:p>
     <w:p>
       <w:pPr>
-        <w:spacing w:line="360" w:lineRule="auto" w:before="80" w:after="40"/>
-        <w:ind w:left="425"/>
+        <w:spacing w:line="360" w:lineRule="auto" w:after="120" w:before="40"/>
+        <w:ind w:firstLine="720"/>
+        <w:jc w:val="both"/>
+      </w:pPr>
+      <w:r>
+        <w:rPr>
+          <w:rFonts w:ascii="Times New Roman" w:hAnsi="Times New Roman" w:eastAsia="Times New Roman"/>
+          <w:b/>
+          <w:i/>
+          <w:sz w:val="24"/>
+        </w:rPr>
+        <w:t xml:space="preserve">Sintesis. </w:t>
+      </w:r>
+      <w:r>
+        <w:rPr>
+          <w:rFonts w:ascii="Times New Roman" w:hAnsi="Times New Roman" w:eastAsia="Times New Roman"/>
+          <w:b w:val="0"/>
+          <w:sz w:val="24"/>
+        </w:rPr>
+        <w:t>Dari uraian tersebut disintesiskan bahwa reputasi yang dikelola dengan baik berpotensi menjadi sumber keunggulan kompetitif yang berkelanjutan bagi sekolah karena sifatnya yang akumulatif, sukar ditiru, dan melekat pada kepercayaan pemangku kepentingan. Reputasi sekolah karenanya bukan sekadar hasil, melainkan aset strategis yang perlu dikelola.</w:t>
+      </w:r>
+    </w:p>
+    <w:p>
+      <w:pPr>
+        <w:spacing w:line="360" w:lineRule="auto" w:before="40" w:after="40"/>
+        <w:ind w:left="850"/>
         <w:jc w:val="left"/>
       </w:pPr>
       <w:r>
@@ -1404,7 +2307,7 @@
           <w:b/>
           <w:sz w:val="24"/>
         </w:rPr>
-        <w:t>2. Manajemen Reputasi</w:t>
+        <w:t>c. Peran Kehumasan dalam Manajemen Reputasi Sekolah</w:t>
       </w:r>
     </w:p>
     <w:p>
@@ -1419,7 +2322,7 @@
           <w:b w:val="0"/>
           <w:sz w:val="24"/>
         </w:rPr>
-        <w:t>Manajemen reputasi (</w:t>
+        <w:t>Kehumasan (</w:t>
       </w:r>
       <w:r>
         <w:rPr>
@@ -1428,49 +2331,54 @@
           <w:i/>
           <w:sz w:val="24"/>
         </w:rPr>
-        <w:t>reputation management</w:t>
-      </w:r>
-      <w:r>
-        <w:rPr>
-          <w:rFonts w:ascii="Times New Roman" w:hAnsi="Times New Roman" w:eastAsia="Times New Roman"/>
-          <w:b w:val="0"/>
-          <w:sz w:val="24"/>
-        </w:rPr>
-        <w:t>) adalah serangkaian aktivitas terencana untuk membangun, memelihara, melindungi, dan memulihkan reputasi organisasi. Şirzad (2022) menempatkan manajemen reputasi sebagai salah satu fungsi utama kehumasan yang bertujuan mengelola hubungan organisasi dengan khalayaknya. Van Riel dan Fombrun (2007) menekankan bahwa manajemen reputasi yang efektif menuntut komunikasi korporat yang terkoordinasi dan konsisten guna menghasilkan modal reputasi. Secara prosedural, manajemen reputasi dapat dipahami melalui tahapan perencanaan (identifikasi pemangku kepentingan, analisis persepsi, dan penetapan tujuan reputasi), pelaksanaan (komunikasi, pelayanan, program unggulan, dan pengelolaan media), serta pemantauan dan evaluasi (pengukuran reputasi serta manajemen krisis). Rayhan dan Muksin (2025) memperlihatkan praktik manajemen reputasi melalui pemantauan media (</w:t>
-      </w:r>
-      <w:r>
-        <w:rPr>
-          <w:rFonts w:ascii="Times New Roman" w:hAnsi="Times New Roman" w:eastAsia="Times New Roman"/>
-          <w:b w:val="0"/>
+        <w:t>public relations</w:t>
+      </w:r>
+      <w:r>
+        <w:rPr>
+          <w:rFonts w:ascii="Times New Roman" w:hAnsi="Times New Roman" w:eastAsia="Times New Roman"/>
+          <w:b w:val="0"/>
+          <w:sz w:val="24"/>
+        </w:rPr>
+        <w:t>) memegang peran sentral dalam membangun dan mengelola reputasi sekolah. Lee (2022) menempatkan kehumasan sebagai fungsi yang menjembatani komunikasi organisasi dengan pemangku kepentingan untuk membentuk reputasi positif. Rosmayani et al. (2025) menunjukkan bahwa strategi humas yang konsisten—melalui pelayanan pendidikan berkualitas dan komunikasi terbuka—membentuk citra, kepercayaan, dan reputasi sekolah Islam. Astuti et al. (2024) menegaskan urgensi manajemen humas dalam membangun citra sekolah, sementara Aprilianti et al. (2023) menambahkan bahwa supervisi pendidikan turut menjaga akuntabilitas, mutu, dan reputasi lembaga.</w:t>
+      </w:r>
+    </w:p>
+    <w:p>
+      <w:pPr>
+        <w:spacing w:line="360" w:lineRule="auto" w:after="120" w:before="40"/>
+        <w:ind w:firstLine="720"/>
+        <w:jc w:val="both"/>
+      </w:pPr>
+      <w:r>
+        <w:rPr>
+          <w:rFonts w:ascii="Times New Roman" w:hAnsi="Times New Roman" w:eastAsia="Times New Roman"/>
+          <w:b/>
           <w:i/>
           <w:sz w:val="24"/>
         </w:rPr>
-        <w:t>media monitoring</w:t>
-      </w:r>
-      <w:r>
-        <w:rPr>
-          <w:rFonts w:ascii="Times New Roman" w:hAnsi="Times New Roman" w:eastAsia="Times New Roman"/>
-          <w:b w:val="0"/>
-          <w:sz w:val="24"/>
-        </w:rPr>
-        <w:t>) dan penyimakan media (</w:t>
-      </w:r>
-      <w:r>
-        <w:rPr>
-          <w:rFonts w:ascii="Times New Roman" w:hAnsi="Times New Roman" w:eastAsia="Times New Roman"/>
-          <w:b w:val="0"/>
-          <w:i/>
-          <w:sz w:val="24"/>
-        </w:rPr>
-        <w:t>media listening</w:t>
-      </w:r>
-      <w:r>
-        <w:rPr>
-          <w:rFonts w:ascii="Times New Roman" w:hAnsi="Times New Roman" w:eastAsia="Times New Roman"/>
-          <w:b w:val="0"/>
-          <w:sz w:val="24"/>
-        </w:rPr>
-        <w:t>), sementara Batu dan Yuningsih (2022) menunjukkan peran program tanggung jawab sosial dalam menjaga reputasi.</w:t>
+        <w:t xml:space="preserve">Sintesis. </w:t>
+      </w:r>
+      <w:r>
+        <w:rPr>
+          <w:rFonts w:ascii="Times New Roman" w:hAnsi="Times New Roman" w:eastAsia="Times New Roman"/>
+          <w:b w:val="0"/>
+          <w:sz w:val="24"/>
+        </w:rPr>
+        <w:t>Sintesisnya, kehumasan, mutu layanan, prestasi, dan komunikasi yang terbuka merupakan instrumen utama dalam strategi manajemen reputasi sekolah. Peran Wakil Kepala Sekolah Bidang Humas dan Bidang Kurikulum menjadi krusial dalam menerjemahkan strategi reputasi ke dalam praktik sehari-hari.</w:t>
+      </w:r>
+    </w:p>
+    <w:p>
+      <w:pPr>
+        <w:spacing w:line="360" w:lineRule="auto" w:before="40" w:after="40"/>
+        <w:ind w:left="850"/>
+        <w:jc w:val="left"/>
+      </w:pPr>
+      <w:r>
+        <w:rPr>
+          <w:rFonts w:ascii="Times New Roman" w:hAnsi="Times New Roman" w:eastAsia="Times New Roman"/>
+          <w:b/>
+          <w:sz w:val="24"/>
+        </w:rPr>
+        <w:t>d. Strategi Manajemen Reputasi dalam Memperkuat Keunggulan Kompetitif Sekolah</w:t>
       </w:r>
     </w:p>
     <w:p>
@@ -1485,380 +2393,31 @@
           <w:b w:val="0"/>
           <w:sz w:val="24"/>
         </w:rPr>
-        <w:t>Pada era digital, manajemen reputasi semakin kompleks karena reputasi turut terbentuk melalui kanal daring. Peco-Torres et al. (2023) menemukan bahwa strategi pengelolaan reputasi daring (</w:t>
-      </w:r>
-      <w:r>
-        <w:rPr>
-          <w:rFonts w:ascii="Times New Roman" w:hAnsi="Times New Roman" w:eastAsia="Times New Roman"/>
-          <w:b w:val="0"/>
-          <w:i/>
-          <w:sz w:val="24"/>
-        </w:rPr>
-        <w:t>online reputation management</w:t>
-      </w:r>
-      <w:r>
-        <w:rPr>
-          <w:rFonts w:ascii="Times New Roman" w:hAnsi="Times New Roman" w:eastAsia="Times New Roman"/>
-          <w:b w:val="0"/>
-          <w:sz w:val="24"/>
-        </w:rPr>
-        <w:t>) berpengaruh positif terhadap reputasi yang dipersepsikan pelanggan. Sebaliknya, Perera et al. (2022) memperingatkan adanya risiko kerusakan reputasi (</w:t>
-      </w:r>
-      <w:r>
-        <w:rPr>
-          <w:rFonts w:ascii="Times New Roman" w:hAnsi="Times New Roman" w:eastAsia="Times New Roman"/>
-          <w:b w:val="0"/>
-          <w:i/>
-          <w:sz w:val="24"/>
-        </w:rPr>
-        <w:t>reputational damage</w:t>
-      </w:r>
-      <w:r>
-        <w:rPr>
-          <w:rFonts w:ascii="Times New Roman" w:hAnsi="Times New Roman" w:eastAsia="Times New Roman"/>
-          <w:b w:val="0"/>
-          <w:sz w:val="24"/>
-        </w:rPr>
-        <w:t>) akibat serangan siber, sehingga organisasi perlu menyiapkan strategi mitigasi dan pemulihan reputasi. Seyferth dan Chung (2025) menegaskan pentingnya transparansi dan kejujuran dalam menghadapi krisis untuk mempertahankan reputasi. Temuan-temuan ini menegaskan bahwa manajemen reputasi merupakan proses berkelanjutan yang menuntut kepekaan terhadap dinamika lingkungan.</w:t>
+        <w:t>Mengacu pada teori reputasi (Fombrun, 1996; Ravasi et al., 2018), teori berbasis sumber daya (Barney, 1991), serta temuan empiris pada lembaga pendidikan (Rosmayani et al., 2025; Warta et al., 2024), strategi manajemen reputasi sekolah dapat dipahami sebagai upaya terencana melalui tahap perencanaan, pelaksanaan, serta pemantauan dan evaluasi yang difokuskan pada penguatan dimensi reputasi (mutu, moral, tata kelola, dan citra) dengan menggerakkan instrumen kehumasan, mutu layanan, dan prestasi. Strategi tersebut diarahkan untuk memperkuat indikator keunggulan kompetitif sekolah, yakni diferensiasi, nilai, daya tarik, dan keberlanjutan.</w:t>
       </w:r>
     </w:p>
     <w:p>
       <w:pPr>
-        <w:spacing w:line="360" w:lineRule="auto" w:before="80" w:after="40"/>
-        <w:ind w:left="425"/>
-        <w:jc w:val="left"/>
-      </w:pPr>
-      <w:r>
-        <w:rPr>
-          <w:rFonts w:ascii="Times New Roman" w:hAnsi="Times New Roman" w:eastAsia="Times New Roman"/>
-          <w:b/>
-          <w:sz w:val="24"/>
-        </w:rPr>
-        <w:t>3. Keunggulan Kompetitif</w:t>
-      </w:r>
-    </w:p>
-    <w:p>
-      <w:pPr>
-        <w:spacing w:line="360" w:lineRule="auto" w:after="120" w:before="0"/>
+        <w:spacing w:line="360" w:lineRule="auto" w:after="120" w:before="40"/>
         <w:ind w:firstLine="720"/>
         <w:jc w:val="both"/>
       </w:pPr>
       <w:r>
         <w:rPr>
           <w:rFonts w:ascii="Times New Roman" w:hAnsi="Times New Roman" w:eastAsia="Times New Roman"/>
-          <w:b w:val="0"/>
-          <w:sz w:val="24"/>
-        </w:rPr>
-        <w:t>Keunggulan kompetitif (</w:t>
-      </w:r>
-      <w:r>
-        <w:rPr>
-          <w:rFonts w:ascii="Times New Roman" w:hAnsi="Times New Roman" w:eastAsia="Times New Roman"/>
-          <w:b w:val="0"/>
+          <w:b/>
           <w:i/>
           <w:sz w:val="24"/>
         </w:rPr>
-        <w:t>competitive advantage</w:t>
-      </w:r>
-      <w:r>
-        <w:rPr>
-          <w:rFonts w:ascii="Times New Roman" w:hAnsi="Times New Roman" w:eastAsia="Times New Roman"/>
-          <w:b w:val="0"/>
-          <w:sz w:val="24"/>
-        </w:rPr>
-        <w:t>) merujuk pada kemampuan organisasi untuk menciptakan nilai lebih unggul dibandingkan pesaing sehingga menghasilkan kinerja superior. Porter (1985) mengemukakan dua strategi generik untuk meraih keunggulan kompetitif, yaitu kepemimpinan biaya (</w:t>
-      </w:r>
-      <w:r>
-        <w:rPr>
-          <w:rFonts w:ascii="Times New Roman" w:hAnsi="Times New Roman" w:eastAsia="Times New Roman"/>
-          <w:b w:val="0"/>
-          <w:i/>
-          <w:sz w:val="24"/>
-        </w:rPr>
-        <w:t>cost leadership</w:t>
-      </w:r>
-      <w:r>
-        <w:rPr>
-          <w:rFonts w:ascii="Times New Roman" w:hAnsi="Times New Roman" w:eastAsia="Times New Roman"/>
-          <w:b w:val="0"/>
-          <w:sz w:val="24"/>
-        </w:rPr>
-        <w:t>) dan diferensiasi (</w:t>
-      </w:r>
-      <w:r>
-        <w:rPr>
-          <w:rFonts w:ascii="Times New Roman" w:hAnsi="Times New Roman" w:eastAsia="Times New Roman"/>
-          <w:b w:val="0"/>
-          <w:i/>
-          <w:sz w:val="24"/>
-        </w:rPr>
-        <w:t>differentiation</w:t>
-      </w:r>
-      <w:r>
-        <w:rPr>
-          <w:rFonts w:ascii="Times New Roman" w:hAnsi="Times New Roman" w:eastAsia="Times New Roman"/>
-          <w:b w:val="0"/>
-          <w:sz w:val="24"/>
-        </w:rPr>
-        <w:t>), yang dapat difokuskan pada segmen tertentu (</w:t>
-      </w:r>
-      <w:r>
-        <w:rPr>
-          <w:rFonts w:ascii="Times New Roman" w:hAnsi="Times New Roman" w:eastAsia="Times New Roman"/>
-          <w:b w:val="0"/>
-          <w:i/>
-          <w:sz w:val="24"/>
-        </w:rPr>
-        <w:t>focus</w:t>
-      </w:r>
-      <w:r>
-        <w:rPr>
-          <w:rFonts w:ascii="Times New Roman" w:hAnsi="Times New Roman" w:eastAsia="Times New Roman"/>
-          <w:b w:val="0"/>
-          <w:sz w:val="24"/>
-        </w:rPr>
-        <w:t>). Perspektif lain, yakni pandangan berbasis sumber daya (</w:t>
-      </w:r>
-      <w:r>
-        <w:rPr>
-          <w:rFonts w:ascii="Times New Roman" w:hAnsi="Times New Roman" w:eastAsia="Times New Roman"/>
-          <w:b w:val="0"/>
-          <w:i/>
-          <w:sz w:val="24"/>
-        </w:rPr>
-        <w:t>resource-based view</w:t>
-      </w:r>
-      <w:r>
-        <w:rPr>
-          <w:rFonts w:ascii="Times New Roman" w:hAnsi="Times New Roman" w:eastAsia="Times New Roman"/>
-          <w:b w:val="0"/>
-          <w:sz w:val="24"/>
-        </w:rPr>
-        <w:t>), menjelaskan bahwa keunggulan kompetitif berkelanjutan bersumber dari sumber daya dan kapabilitas yang bernilai, langka, sukar ditiru, dan tak tergantikan (Barney, 1991; Assensoh-Kodua, 2019). Reputasi, sebagai sumber daya tak berwujud yang sukar ditiru, memenuhi kriteria tersebut dan karenanya menjadi basis keunggulan kompetitif yang potensial.</w:t>
-      </w:r>
-    </w:p>
-    <w:p>
-      <w:pPr>
-        <w:spacing w:line="360" w:lineRule="auto" w:after="120" w:before="0"/>
-        <w:ind w:firstLine="720"/>
-        <w:jc w:val="both"/>
-      </w:pPr>
-      <w:r>
-        <w:rPr>
-          <w:rFonts w:ascii="Times New Roman" w:hAnsi="Times New Roman" w:eastAsia="Times New Roman"/>
-          <w:b w:val="0"/>
-          <w:sz w:val="24"/>
-        </w:rPr>
-        <w:t xml:space="preserve">Sejumlah penelitian empiris menegaskan beragam sumber keunggulan kompetitif. Inovasi dan kinerja (Farida &amp; Setiawan, 2022), orientasi pasar (Puspaningrum, 2020; Udriyah et al., 2019), inovasi produk dan </w:t>
-      </w:r>
-      <w:r>
-        <w:rPr>
-          <w:rFonts w:ascii="Times New Roman" w:hAnsi="Times New Roman" w:eastAsia="Times New Roman"/>
-          <w:b w:val="0"/>
-          <w:i/>
-          <w:sz w:val="24"/>
-        </w:rPr>
-        <w:t>market driving</w:t>
-      </w:r>
-      <w:r>
-        <w:rPr>
-          <w:rFonts w:ascii="Times New Roman" w:hAnsi="Times New Roman" w:eastAsia="Times New Roman"/>
-          <w:b w:val="0"/>
-          <w:sz w:val="24"/>
-        </w:rPr>
-        <w:t xml:space="preserve"> (Kuncoro &amp; Suriani, 2018), kapabilitas dinamis dan keberlanjutan (Bari et al., 2024), kepemimpinan strategis dan manajemen pengetahuan (Mahdi &amp; Nassar, 2021), manajemen sumber daya manusia strategis (Hamadamin &amp; Atan, 2019), serta pemecahan masalah kompleks (Veríssimo et al., 2024) terbukti berkontribusi terhadap keunggulan kompetitif. Pada konteks ekonomi digital, Koch dan Windsperger (2017) mengajukan pandangan berbasis jaringan (</w:t>
-      </w:r>
-      <w:r>
-        <w:rPr>
-          <w:rFonts w:ascii="Times New Roman" w:hAnsi="Times New Roman" w:eastAsia="Times New Roman"/>
-          <w:b w:val="0"/>
-          <w:i/>
-          <w:sz w:val="24"/>
-        </w:rPr>
-        <w:t>network-centric view</w:t>
-      </w:r>
-      <w:r>
-        <w:rPr>
-          <w:rFonts w:ascii="Times New Roman" w:hAnsi="Times New Roman" w:eastAsia="Times New Roman"/>
-          <w:b w:val="0"/>
-          <w:sz w:val="24"/>
-        </w:rPr>
-        <w:t>) sebagai penjelasan baru atas keunggulan kompetitif. Romeo Asa et al. (2024) mengintegrasikan sumber daya, kapabilitas, dan inovasi terbuka dalam satu pendekatan menuju keunggulan kompetitif berkelanjutan.</w:t>
-      </w:r>
-    </w:p>
-    <w:p>
-      <w:pPr>
-        <w:spacing w:line="360" w:lineRule="auto" w:before="80" w:after="40"/>
-        <w:ind w:left="425"/>
-        <w:jc w:val="left"/>
-      </w:pPr>
-      <w:r>
-        <w:rPr>
-          <w:rFonts w:ascii="Times New Roman" w:hAnsi="Times New Roman" w:eastAsia="Times New Roman"/>
-          <w:b/>
-          <w:sz w:val="24"/>
-        </w:rPr>
-        <w:t>4. Keunggulan Kompetitif dalam Konteks Lembaga Pendidikan</w:t>
-      </w:r>
-    </w:p>
-    <w:p>
-      <w:pPr>
-        <w:spacing w:line="360" w:lineRule="auto" w:after="120" w:before="0"/>
-        <w:ind w:firstLine="720"/>
-        <w:jc w:val="both"/>
-      </w:pPr>
-      <w:r>
-        <w:rPr>
-          <w:rFonts w:ascii="Times New Roman" w:hAnsi="Times New Roman" w:eastAsia="Times New Roman"/>
-          <w:b w:val="0"/>
-          <w:sz w:val="24"/>
-        </w:rPr>
-        <w:t>Dalam ranah pendidikan, keunggulan kompetitif dipahami sebagai kemampuan sekolah menghadirkan layanan dan nilai yang lebih unggul sehingga mampu menarik, memuaskan, dan mempertahankan peserta didik serta pemangku kepentingan. Hart dan Rodgers (2024) menemukan bahwa institusi pendidikan kini bersaing layaknya organisasi bisnis dan membutuhkan strategi yang jelas untuk membedakan diri. Supardi dan Herawan (2020) menunjukkan bahwa intelijen kompetitif (</w:t>
-      </w:r>
-      <w:r>
-        <w:rPr>
-          <w:rFonts w:ascii="Times New Roman" w:hAnsi="Times New Roman" w:eastAsia="Times New Roman"/>
-          <w:b w:val="0"/>
-          <w:i/>
-          <w:sz w:val="24"/>
-        </w:rPr>
-        <w:t>competitive intelligence</w:t>
-      </w:r>
-      <w:r>
-        <w:rPr>
-          <w:rFonts w:ascii="Times New Roman" w:hAnsi="Times New Roman" w:eastAsia="Times New Roman"/>
-          <w:b w:val="0"/>
-          <w:sz w:val="24"/>
-        </w:rPr>
-        <w:t>) membantu sekolah meraih keunggulan kompetitif berkelanjutan. Asrulla et al. (2025) membuktikan pengaruh strategi diferensiasi dan keunggulan biaya melalui penciptaan nilai terhadap keunggulan kompetitif sekolah Islam terpadu, sedangkan Sahrul et al. (2024) menempatkan citra sekolah (</w:t>
-      </w:r>
-      <w:r>
-        <w:rPr>
-          <w:rFonts w:ascii="Times New Roman" w:hAnsi="Times New Roman" w:eastAsia="Times New Roman"/>
-          <w:b w:val="0"/>
-          <w:i/>
-          <w:sz w:val="24"/>
-        </w:rPr>
-        <w:t>school image</w:t>
-      </w:r>
-      <w:r>
-        <w:rPr>
-          <w:rFonts w:ascii="Times New Roman" w:hAnsi="Times New Roman" w:eastAsia="Times New Roman"/>
-          <w:b w:val="0"/>
-          <w:sz w:val="24"/>
-        </w:rPr>
-        <w:t xml:space="preserve">) sebagai variabel </w:t>
-      </w:r>
-      <w:r>
-        <w:rPr>
-          <w:rFonts w:ascii="Times New Roman" w:hAnsi="Times New Roman" w:eastAsia="Times New Roman"/>
-          <w:b w:val="0"/>
-          <w:i/>
-          <w:sz w:val="24"/>
-        </w:rPr>
-        <w:t>intervening</w:t>
-      </w:r>
-      <w:r>
-        <w:rPr>
-          <w:rFonts w:ascii="Times New Roman" w:hAnsi="Times New Roman" w:eastAsia="Times New Roman"/>
-          <w:b w:val="0"/>
-          <w:sz w:val="24"/>
-        </w:rPr>
-        <w:t xml:space="preserve"> menuju keunggulan kompetitif berkelanjutan. Hifza dan Aslan (2020) merumuskan model pengembangan keunggulan kompetitif pada lembaga pendidikan Islam swasta yang menekankan identitas keagamaan dan pengembangan potensi sumber daya manusia. Temuan-temuan ini menegaskan relevansi konsep keunggulan kompetitif bagi pengelolaan sekolah, termasuk sekolah dasar.</w:t>
-      </w:r>
-    </w:p>
-    <w:p>
-      <w:pPr>
-        <w:spacing w:line="360" w:lineRule="auto" w:before="80" w:after="40"/>
-        <w:ind w:left="425"/>
-        <w:jc w:val="left"/>
-      </w:pPr>
-      <w:r>
-        <w:rPr>
-          <w:rFonts w:ascii="Times New Roman" w:hAnsi="Times New Roman" w:eastAsia="Times New Roman"/>
-          <w:b/>
-          <w:sz w:val="24"/>
-        </w:rPr>
-        <w:t>5. Reputasi sebagai Sumber Keunggulan Kompetitif Lembaga Pendidikan</w:t>
-      </w:r>
-    </w:p>
-    <w:p>
-      <w:pPr>
-        <w:spacing w:line="360" w:lineRule="auto" w:after="120" w:before="0"/>
-        <w:ind w:firstLine="720"/>
-        <w:jc w:val="both"/>
-      </w:pPr>
-      <w:r>
-        <w:rPr>
-          <w:rFonts w:ascii="Times New Roman" w:hAnsi="Times New Roman" w:eastAsia="Times New Roman"/>
-          <w:b w:val="0"/>
-          <w:sz w:val="24"/>
-        </w:rPr>
-        <w:t>Reputasi dan keunggulan kompetitif memiliki keterkaitan yang erat. Gao et al. (2017) menjelaskan bahwa reputasi dapat menjadi penopang kelangsungan hidup jangka panjang organisasi, terutama dalam lingkungan dengan kekosongan kelembagaan (</w:t>
-      </w:r>
-      <w:r>
-        <w:rPr>
-          <w:rFonts w:ascii="Times New Roman" w:hAnsi="Times New Roman" w:eastAsia="Times New Roman"/>
-          <w:b w:val="0"/>
-          <w:i/>
-          <w:sz w:val="24"/>
-        </w:rPr>
-        <w:t>institutional voids</w:t>
-      </w:r>
-      <w:r>
-        <w:rPr>
-          <w:rFonts w:ascii="Times New Roman" w:hAnsi="Times New Roman" w:eastAsia="Times New Roman"/>
-          <w:b w:val="0"/>
-          <w:sz w:val="24"/>
-        </w:rPr>
-        <w:t>). Lee (2022) menegaskan bahwa reputasi yang baik memungkinkan organisasi mempertahankan keunggulan kompetitif. Pada lembaga pendidikan, Warta et al. (2024) menemukan bahwa manajemen reputasi sekolah merupakan kunci keberlanjutan institusi dan pencapaian predikat unggul. Hidalgo-Peñate et al. (2024) membuktikan bahwa pemanfaatan sumber daya teknologi memperkuat kapabilitas dinamis yang pada gilirannya meningkatkan reputasi sekolah vokasi. Dengan demikian, reputasi yang dikelola dengan baik berpotensi menjadi sumber keunggulan kompetitif yang berkelanjutan bagi sekolah karena sifatnya yang akumulatif, sukar ditiru, dan melekat pada kepercayaan pemangku kepentingan.</w:t>
-      </w:r>
-    </w:p>
-    <w:p>
-      <w:pPr>
-        <w:spacing w:line="360" w:lineRule="auto" w:before="80" w:after="40"/>
-        <w:ind w:left="425"/>
-        <w:jc w:val="left"/>
-      </w:pPr>
-      <w:r>
-        <w:rPr>
-          <w:rFonts w:ascii="Times New Roman" w:hAnsi="Times New Roman" w:eastAsia="Times New Roman"/>
-          <w:b/>
-          <w:sz w:val="24"/>
-        </w:rPr>
-        <w:t>6. Peran Kehumasan dalam Manajemen Reputasi Sekolah</w:t>
-      </w:r>
-    </w:p>
-    <w:p>
-      <w:pPr>
-        <w:spacing w:line="360" w:lineRule="auto" w:after="120" w:before="0"/>
-        <w:ind w:firstLine="720"/>
-        <w:jc w:val="both"/>
-      </w:pPr>
-      <w:r>
-        <w:rPr>
-          <w:rFonts w:ascii="Times New Roman" w:hAnsi="Times New Roman" w:eastAsia="Times New Roman"/>
-          <w:b w:val="0"/>
-          <w:sz w:val="24"/>
-        </w:rPr>
-        <w:t>Kehumasan (</w:t>
-      </w:r>
-      <w:r>
-        <w:rPr>
-          <w:rFonts w:ascii="Times New Roman" w:hAnsi="Times New Roman" w:eastAsia="Times New Roman"/>
-          <w:b w:val="0"/>
-          <w:i/>
-          <w:sz w:val="24"/>
-        </w:rPr>
-        <w:t>public relations</w:t>
-      </w:r>
-      <w:r>
-        <w:rPr>
-          <w:rFonts w:ascii="Times New Roman" w:hAnsi="Times New Roman" w:eastAsia="Times New Roman"/>
-          <w:b w:val="0"/>
-          <w:sz w:val="24"/>
-        </w:rPr>
-        <w:t>) memegang peran sentral dalam membangun dan mengelola reputasi sekolah. Lee (2022) menempatkan kehumasan sebagai fungsi yang menjembatani komunikasi organisasi dengan beragam pemangku kepentingan untuk membentuk reputasi yang positif. Dalam konteks persekolahan, Rosmayani et al. (2025) menunjukkan bahwa strategi humas yang konsisten—melalui pelayanan pendidikan yang berkualitas dan komunikasi terbuka—membentuk citra positif, kepercayaan, dan reputasi sekolah Islam. Astuti et al. (2024) menegaskan urgensi manajemen humas dalam membangun citra sekolah di tengah persaingan pendidikan yang ketat dan era keterbukaan informasi. Aprilianti et al. (2023) melengkapinya dengan temuan bahwa supervisi pendidikan turut menjaga akuntabilitas, mutu, dan reputasi lembaga. Sintesis kajian ini menempatkan humas, mutu layanan, prestasi, dan komunikasi sebagai instrumen utama dalam strategi manajemen reputasi sekolah.</w:t>
+        <w:t xml:space="preserve">Sintesis. </w:t>
+      </w:r>
+      <w:r>
+        <w:rPr>
+          <w:rFonts w:ascii="Times New Roman" w:hAnsi="Times New Roman" w:eastAsia="Times New Roman"/>
+          <w:b w:val="0"/>
+          <w:sz w:val="24"/>
+        </w:rPr>
+        <w:t>Secara keseluruhan, kajian teori ini menyimpulkan bahwa strategi manajemen reputasi yang dijalankan secara sistematis berpotensi memperkuat keunggulan kompetitif sekolah. Kerangka inilah yang digunakan untuk menelaah praktik di SD Muhammadiyah Condongcatur, sekaligus menjadi dasar penyusunan alur pikir dan instrumen penelitian.</w:t>
       </w:r>
     </w:p>
     <w:p>
@@ -2280,7 +2839,7 @@
           <w:b w:val="0"/>
           <w:sz w:val="24"/>
         </w:rPr>
-        <w:t>Berdasarkan kerangka berpikir di atas, pertanyaan penelitian dirumuskan sebagai berikut.</w:t>
+        <w:t>Berdasarkan rumusan masalah dan kerangka berpikir di atas, pertanyaan penelitian dijabarkan ke dalam dua kelompok pertanyaan utama yang masing-masing dilengkapi pertanyaan operasional sebagai berikut.</w:t>
       </w:r>
     </w:p>
     <w:p>
@@ -2295,7 +2854,67 @@
           <w:b w:val="0"/>
           <w:sz w:val="24"/>
         </w:rPr>
-        <w:t>1. Bagaimana perencanaan strategi manajemen reputasi di SD Muhammadiyah Condongcatur, meliputi analisis pemangku kepentingan, penetapan tujuan reputasi, dan perumusan program?</w:t>
+        <w:t>1. Bagaimana strategi manajemen reputasi dalam memperkuat keunggulan kompetitif di SD Muhammadiyah Condongcatur?</w:t>
+      </w:r>
+    </w:p>
+    <w:p>
+      <w:pPr>
+        <w:spacing w:line="360" w:lineRule="auto" w:after="80"/>
+        <w:ind w:left="1276" w:hanging="425"/>
+        <w:jc w:val="both"/>
+      </w:pPr>
+      <w:r>
+        <w:rPr>
+          <w:rFonts w:ascii="Times New Roman" w:hAnsi="Times New Roman" w:eastAsia="Times New Roman"/>
+          <w:b w:val="0"/>
+          <w:sz w:val="24"/>
+        </w:rPr>
+        <w:t>a. Bagaimana perencanaan strategi manajemen reputasi, meliputi analisis pemangku kepentingan, penetapan tujuan reputasi, dan perumusan program?</w:t>
+      </w:r>
+    </w:p>
+    <w:p>
+      <w:pPr>
+        <w:spacing w:line="360" w:lineRule="auto" w:after="80"/>
+        <w:ind w:left="1276" w:hanging="425"/>
+        <w:jc w:val="both"/>
+      </w:pPr>
+      <w:r>
+        <w:rPr>
+          <w:rFonts w:ascii="Times New Roman" w:hAnsi="Times New Roman" w:eastAsia="Times New Roman"/>
+          <w:b w:val="0"/>
+          <w:sz w:val="24"/>
+        </w:rPr>
+        <w:t>b. Bagaimana pelaksanaan strategi manajemen reputasi, meliputi peran kehumasan, mutu layanan, pengelolaan prestasi, dan komunikasi dengan wali murid?</w:t>
+      </w:r>
+    </w:p>
+    <w:p>
+      <w:pPr>
+        <w:spacing w:line="360" w:lineRule="auto" w:after="80"/>
+        <w:ind w:left="1276" w:hanging="425"/>
+        <w:jc w:val="both"/>
+      </w:pPr>
+      <w:r>
+        <w:rPr>
+          <w:rFonts w:ascii="Times New Roman" w:hAnsi="Times New Roman" w:eastAsia="Times New Roman"/>
+          <w:b w:val="0"/>
+          <w:sz w:val="24"/>
+        </w:rPr>
+        <w:t>c. Bagaimana pemantauan dan evaluasi strategi manajemen reputasi dilakukan?</w:t>
+      </w:r>
+    </w:p>
+    <w:p>
+      <w:pPr>
+        <w:spacing w:line="360" w:lineRule="auto" w:after="80"/>
+        <w:ind w:left="1276" w:hanging="425"/>
+        <w:jc w:val="both"/>
+      </w:pPr>
+      <w:r>
+        <w:rPr>
+          <w:rFonts w:ascii="Times New Roman" w:hAnsi="Times New Roman" w:eastAsia="Times New Roman"/>
+          <w:b w:val="0"/>
+          <w:sz w:val="24"/>
+        </w:rPr>
+        <w:t>d. Bagaimana keterkaitan strategi manajemen reputasi dengan penguatan keunggulan kompetitif sekolah (diferensiasi, nilai, daya tarik, dan keberlanjutan)?</w:t>
       </w:r>
     </w:p>
     <w:p>
@@ -2310,13 +2929,13 @@
           <w:b w:val="0"/>
           <w:sz w:val="24"/>
         </w:rPr>
-        <w:t>2. Bagaimana pelaksanaan strategi manajemen reputasi dalam memperkuat keunggulan kompetitif di SD Muhammadiyah Condongcatur, meliputi peran kehumasan, mutu layanan, pengelolaan prestasi, dan komunikasi dengan wali murid?</w:t>
+        <w:t>2. Apa faktor pendukung dan penghambat strategi manajemen reputasi dalam memperkuat keunggulan kompetitif di SD Muhammadiyah Condongcatur?</w:t>
       </w:r>
     </w:p>
     <w:p>
       <w:pPr>
         <w:spacing w:line="360" w:lineRule="auto" w:after="80"/>
-        <w:ind w:left="850" w:hanging="425"/>
+        <w:ind w:left="1276" w:hanging="425"/>
         <w:jc w:val="both"/>
       </w:pPr>
       <w:r>
@@ -2325,13 +2944,13 @@
           <w:b w:val="0"/>
           <w:sz w:val="24"/>
         </w:rPr>
-        <w:t>3. Bagaimana pemantauan dan evaluasi strategi manajemen reputasi di SD Muhammadiyah Condongcatur dilakukan?</w:t>
+        <w:t>a. Apa saja faktor pendukung strategi manajemen reputasi sekolah?</w:t>
       </w:r>
     </w:p>
     <w:p>
       <w:pPr>
         <w:spacing w:line="360" w:lineRule="auto" w:after="80"/>
-        <w:ind w:left="850" w:hanging="425"/>
+        <w:ind w:left="1276" w:hanging="425"/>
         <w:jc w:val="both"/>
       </w:pPr>
       <w:r>
@@ -2340,22 +2959,7 @@
           <w:b w:val="0"/>
           <w:sz w:val="24"/>
         </w:rPr>
-        <w:t>4. Bagaimana keterkaitan strategi manajemen reputasi dengan penguatan keunggulan kompetitif sekolah?</w:t>
-      </w:r>
-    </w:p>
-    <w:p>
-      <w:pPr>
-        <w:spacing w:line="360" w:lineRule="auto" w:after="80"/>
-        <w:ind w:left="850" w:hanging="425"/>
-        <w:jc w:val="both"/>
-      </w:pPr>
-      <w:r>
-        <w:rPr>
-          <w:rFonts w:ascii="Times New Roman" w:hAnsi="Times New Roman" w:eastAsia="Times New Roman"/>
-          <w:b w:val="0"/>
-          <w:sz w:val="24"/>
-        </w:rPr>
-        <w:t>5. Apa saja faktor pendukung dan penghambat dalam implementasi strategi manajemen reputasi di SD Muhammadiyah Condongcatur?</w:t>
+        <w:t>b. Apa saja faktor penghambat strategi manajemen reputasi sekolah serta upaya mengatasinya?</w:t>
       </w:r>
     </w:p>
     <w:p>

</xml_diff>